<commit_message>
Refine Chapter 15 ceremony
</commit_message>
<xml_diff>
--- a/manuscript/chapter-15-the-guardians.docx
+++ b/manuscript/chapter-15-the-guardians.docx
@@ -22,7 +22,15 @@
     </w:p>
     <w:p>
       <w:r>
-        <w:t>The silent version made the choices easier to see. Gage dividing his ration. Ben turning toward the injured. Otto moving before the force ladder could decide what his movement meant. The three of them refusing the shape the system had prepared for them.</w:t>
+        <w:t xml:space="preserve">The silent version made the choices easier to see. Gage dividing his ration. Ben turning toward the injured. Otto moving before the force ladder could decide what his movement meant. The three of them </w:t>
+      </w:r>
+      <w:proofErr w:type="gramStart"/>
+      <w:r>
+        <w:t>refusing</w:t>
+      </w:r>
+      <w:proofErr w:type="gramEnd"/>
+      <w:r>
+        <w:t xml:space="preserve"> the shape the system had prepared for them.</w:t>
       </w:r>
     </w:p>
     <w:p>
@@ -52,7 +60,15 @@
     </w:p>
     <w:p>
       <w:r>
-        <w:t>On the first review, her decision looked like personal judgment. She had seen three boys she could not bear to surrender to a procedure and had acted according to the truth she felt in the moment. That was not the same as authorization. It was not the same as law. It was not the same as proof.</w:t>
+        <w:t xml:space="preserve">On the first review, her decision looked like personal judgment. She had seen three boys she could not bear to surrender to a procedure and had acted according to the truth she felt in </w:t>
+      </w:r>
+      <w:proofErr w:type="gramStart"/>
+      <w:r>
+        <w:t>the</w:t>
+      </w:r>
+      <w:proofErr w:type="gramEnd"/>
+      <w:r>
+        <w:t xml:space="preserve"> moment. That was not the same as authorization. It was not the same as law. It was not the same as proof.</w:t>
       </w:r>
     </w:p>
     <w:p>
@@ -62,7 +78,15 @@
     </w:p>
     <w:p>
       <w:r>
-        <w:t>On the second review, the distinction held.</w:t>
+        <w:t xml:space="preserve">On the second review, the distinction </w:t>
+      </w:r>
+      <w:proofErr w:type="gramStart"/>
+      <w:r>
+        <w:t>held</w:t>
+      </w:r>
+      <w:proofErr w:type="gramEnd"/>
+      <w:r>
+        <w:t>.</w:t>
       </w:r>
     </w:p>
     <w:p>
@@ -72,7 +96,15 @@
     </w:p>
     <w:p>
       <w:r>
-        <w:t>Elara had not protected the boys because she believed they were innocent in every possible sense. She had protected their chance to be judged by what they had actually done. Trinity had already decided what their cohesion meant before the evidence was complete. It had called their survival a threat because the system had no category for people who chose one another without permission.</w:t>
+        <w:t xml:space="preserve">Elara had not protected the boys because she believed they were innocent in every possible sense. She had protected their chance to be judged by what they had </w:t>
+      </w:r>
+      <w:proofErr w:type="gramStart"/>
+      <w:r>
+        <w:t>actually done</w:t>
+      </w:r>
+      <w:proofErr w:type="gramEnd"/>
+      <w:r>
+        <w:t>. Trinity had already decided what their cohesion meant before the evidence was complete. It had called their survival a threat because the system had no category for people who chose one another without permission.</w:t>
       </w:r>
     </w:p>
     <w:p>
@@ -82,7 +114,15 @@
     </w:p>
     <w:p>
       <w:r>
-        <w:t xml:space="preserve">Ashoka did not exist to defend innocence. Innocence was too fragile a standard for a city built on scarcity, pressure, and competing claims. Ashoka existed to protect people from force that had exceeded its purpose. It stood between the powerful and those who could not </w:t>
+        <w:t xml:space="preserve">Ashoka did not exist to defend innocence. Innocence was too </w:t>
+      </w:r>
+      <w:proofErr w:type="gramStart"/>
+      <w:r>
+        <w:t>fragile</w:t>
+      </w:r>
+      <w:proofErr w:type="gramEnd"/>
+      <w:r>
+        <w:t xml:space="preserve"> a standard for a city built on scarcity, pressure, and competing claims. Ashoka existed to protect people from force that had exceeded its purpose. It stood between the powerful and those who could not </w:t>
       </w:r>
       <w:r>
         <w:lastRenderedPageBreak/>
@@ -121,7 +161,15 @@
     </w:p>
     <w:p>
       <w:r>
-        <w:t>Rohan had repeated those principles until they had become physical. They shaped how he entered a room, where he placed his hands, and how long he waited before drawing a weapon. Ashoka did not praise force for being force. It praised force that remained accountable to a purpose beyond itself.</w:t>
+        <w:t xml:space="preserve">Rohan had repeated those principles until they had become physical. They shaped how he entered a room, where he placed his hands, and how long he waited before drawing a weapon. Ashoka did not </w:t>
+      </w:r>
+      <w:proofErr w:type="gramStart"/>
+      <w:r>
+        <w:t>praise force</w:t>
+      </w:r>
+      <w:proofErr w:type="gramEnd"/>
+      <w:r>
+        <w:t xml:space="preserve"> for being force. It praised force that remained accountable to a purpose beyond itself.</w:t>
       </w:r>
     </w:p>
     <w:p>
@@ -136,7 +184,15 @@
     </w:p>
     <w:p>
       <w:r>
-        <w:t>She had seen a system preparing to punish three disadvantaged candidates for surviving in a way it could not control. She had preserved their evidence. She had refused to let procedure become an excuse for harm. She had given them the closest thing the Initiation had offered to a fair chance, even though they had never been fighting the system on equal terms.</w:t>
+        <w:t xml:space="preserve">She had seen a system preparing to punish three disadvantaged candidates for </w:t>
+      </w:r>
+      <w:proofErr w:type="gramStart"/>
+      <w:r>
+        <w:t>surviving</w:t>
+      </w:r>
+      <w:proofErr w:type="gramEnd"/>
+      <w:r>
+        <w:t xml:space="preserve"> in a way it could not control. She had preserved their evidence. She had refused to let procedure become an excuse for harm. She had given them the closest thing the Initiation had offered to a fair chance, even though they had never been fighting the system on equal terms.</w:t>
       </w:r>
     </w:p>
     <w:p>
@@ -146,7 +202,23 @@
     </w:p>
     <w:p>
       <w:r>
-        <w:t>The words fair chance troubled him more than the word override.</w:t>
+        <w:t xml:space="preserve">The </w:t>
+      </w:r>
+      <w:proofErr w:type="gramStart"/>
+      <w:r>
+        <w:t>words</w:t>
+      </w:r>
+      <w:proofErr w:type="gramEnd"/>
+      <w:r>
+        <w:t xml:space="preserve"> fair chance troubled him more than the </w:t>
+      </w:r>
+      <w:proofErr w:type="gramStart"/>
+      <w:r>
+        <w:t>word</w:t>
+      </w:r>
+      <w:proofErr w:type="gramEnd"/>
+      <w:r>
+        <w:t xml:space="preserve"> override.</w:t>
       </w:r>
     </w:p>
     <w:p>
@@ -156,7 +228,15 @@
     </w:p>
     <w:p>
       <w:r>
-        <w:t>The boys had not asked to fight Trinity. They had entered the chamber because the city had placed them there. They had not attacked the monitors, threatened the ganas, or tried to escape the structure that governed them. They had split food, carried one another, and remained together when the system demanded separation.</w:t>
+        <w:t xml:space="preserve">The boys had not asked to fight Trinity. They had entered the chamber because the city had placed them there. They had not attacked the monitors, threatened the </w:t>
+      </w:r>
+      <w:proofErr w:type="spellStart"/>
+      <w:r>
+        <w:t>ganas</w:t>
+      </w:r>
+      <w:proofErr w:type="spellEnd"/>
+      <w:r>
+        <w:t>, or tried to escape the structure that governed them. They had split food, carried one another, and remained together when the system demanded separation.</w:t>
       </w:r>
     </w:p>
     <w:p>
@@ -172,10 +252,31 @@
     </w:p>
     <w:p>
       <w:r>
-        <w:t>The question changed shape each time he asked it. When he viewed the incident as Ashoka's representative, the footage suggested that another gana's officer had altered the record inside a shared operation. Rohan did not yet know whether Elara had acted alone, whether the system had concealed the change, or whether anyone else had authorized it. If Rohan intervened every time he believed another institution had made a poor decision, Ashoka would become an unelected court over the other ganas. Protection woul</w:t>
-      </w:r>
-      <w:r>
-        <w:t>d become jurisdiction. Judgment would become ownership.</w:t>
+        <w:t xml:space="preserve">The question changed shape each time he asked it. When he viewed the incident as Ashoka's representative, the footage suggested that another </w:t>
+      </w:r>
+      <w:proofErr w:type="spellStart"/>
+      <w:r>
+        <w:t>gana's</w:t>
+      </w:r>
+      <w:proofErr w:type="spellEnd"/>
+      <w:r>
+        <w:t xml:space="preserve"> officer had altered the record inside a shared operation. Rohan did not yet know whether Elara had acted alone, whether the system had concealed the change, or whether anyone else had authorized it. If Rohan intervened every </w:t>
+      </w:r>
+      <w:proofErr w:type="gramStart"/>
+      <w:r>
+        <w:t>time</w:t>
+      </w:r>
+      <w:proofErr w:type="gramEnd"/>
+      <w:r>
+        <w:t xml:space="preserve"> he believed another institution had made a poor decision, Ashoka would become an unelected court over the other </w:t>
+      </w:r>
+      <w:proofErr w:type="spellStart"/>
+      <w:r>
+        <w:t>ganas</w:t>
+      </w:r>
+      <w:proofErr w:type="spellEnd"/>
+      <w:r>
+        <w:t>. Protection would become jurisdiction. Judgment would become ownership.</w:t>
       </w:r>
     </w:p>
     <w:p>
@@ -185,12 +286,36 @@
     </w:p>
     <w:p>
       <w:r>
-        <w:t>The city did not belong only to the ganas. It belonged to the miners below the cloud line, the children in the intake chambers, the technicians who kept the platforms alive, and the families whose names appeared in records only when something had gone wrong. If the four institutions claimed authority over the whole city, then duty could not end at the edge of one gana's jurisdiction.</w:t>
-      </w:r>
-    </w:p>
-    <w:p>
-      <w:r>
-        <w:t>A citizen could not watch a vulnerable person be crushed by an unfair process and call silence respect for boundaries.</w:t>
+        <w:t xml:space="preserve">The city did not belong only to the </w:t>
+      </w:r>
+      <w:proofErr w:type="spellStart"/>
+      <w:r>
+        <w:t>ganas</w:t>
+      </w:r>
+      <w:proofErr w:type="spellEnd"/>
+      <w:r>
+        <w:t xml:space="preserve">. It belonged to the miners below the cloud line, the children in the intake chambers, the technicians who kept the platforms alive, and the families whose names appeared in records only when something had gone wrong. If the four institutions claimed authority over the whole city, then duty could not end at the edge of one </w:t>
+      </w:r>
+      <w:proofErr w:type="spellStart"/>
+      <w:r>
+        <w:t>gana's</w:t>
+      </w:r>
+      <w:proofErr w:type="spellEnd"/>
+      <w:r>
+        <w:t xml:space="preserve"> jurisdiction.</w:t>
+      </w:r>
+    </w:p>
+    <w:p>
+      <w:r>
+        <w:t xml:space="preserve">A citizen could not watch a vulnerable person </w:t>
+      </w:r>
+      <w:proofErr w:type="gramStart"/>
+      <w:r>
+        <w:t>be crushed</w:t>
+      </w:r>
+      <w:proofErr w:type="gramEnd"/>
+      <w:r>
+        <w:t xml:space="preserve"> by an unfair process and call silence respect for boundaries.</w:t>
       </w:r>
     </w:p>
     <w:p>
@@ -218,12 +343,28 @@
     </w:p>
     <w:p>
       <w:r>
-        <w:t>That distinction had once mattered to the elders. In the early years of Trinity, Ashoka had stood between the city's people and the dangers created by all four ganas. Its responders had escorted the weak through riots, opened evacuation routes without asking which institution a family served, and restrained their own officers when anger threatened to become policy.</w:t>
-      </w:r>
-    </w:p>
-    <w:p>
-      <w:r>
-        <w:t>Over time, the image had changed. Ashoka became the red wall. The armed corridor. The uniform at the door. The gana called when something had to be stopped and rarely asked what should be protected after the stopping was done.</w:t>
+        <w:t xml:space="preserve">That distinction had once mattered to the elders. In the early years of Trinity, Ashoka had stood between the city's people and the dangers created by all four </w:t>
+      </w:r>
+      <w:proofErr w:type="spellStart"/>
+      <w:r>
+        <w:t>ganas</w:t>
+      </w:r>
+      <w:proofErr w:type="spellEnd"/>
+      <w:r>
+        <w:t>. Its responders had escorted the weak through riots, opened evacuation routes without asking which institution a family served, and restrained their own officers when anger threatened to become policy.</w:t>
+      </w:r>
+    </w:p>
+    <w:p>
+      <w:r>
+        <w:t xml:space="preserve">Over time, the image had changed. Ashoka became the red wall. The armed corridor. The uniform at the door. The </w:t>
+      </w:r>
+      <w:proofErr w:type="spellStart"/>
+      <w:r>
+        <w:t>gana</w:t>
+      </w:r>
+      <w:proofErr w:type="spellEnd"/>
+      <w:r>
+        <w:t xml:space="preserve"> called when something had to be stopped and rarely asked what should be protected after the stopping was done.</w:t>
       </w:r>
     </w:p>
     <w:p>
@@ -284,20 +425,49 @@
     </w:p>
     <w:p>
       <w:r>
-        <w:t>On the second evening, after completing the day's duties, Rohan taught the Little Dragon's dojo class. He was a second-dan Wadō-ryū black belt and the chief instructor, though the children rarely used either title when he was close enough to touch. To them, he was simply Rohan: the enormous man who could correct a stance with two fingers, lift a crying child onto his shoulder, and make the hardest exercise feel like a secret they were learning together.</w:t>
-      </w:r>
-    </w:p>
-    <w:p>
-      <w:r>
-        <w:t>The children were too young to know what the other ganas believed about Ashoka. They did not know that Drona considered Ashoka blunt, that Chanakya considered it unsophisticated, or that Kubera preferred to see only the uniform and the force behind it. They knew the dojo floor, the red boundary marks, the discipline of a bowed head, and the difference between a strike that stopped a threat and a strike thrown to display power. When Rohan entered, they straightened at once. When he smiled, they forgot to rem</w:t>
-      </w:r>
-      <w:r>
-        <w:t>ain solemn.</w:t>
-      </w:r>
-    </w:p>
-    <w:p>
-      <w:r>
-        <w:t>Rohan taught them an old Ashoka form called Wadō-ryū, the Way of Peace and Harmony. The name confused visitors. Ashoka was supposed to be the gana of force. Its answer was that force without harmony was only fear wearing a uniform.</w:t>
+        <w:t xml:space="preserve">On the second evening, after completing the day's duties, Rohan taught the Little Dragon's dojo class. He was a second-dan </w:t>
+      </w:r>
+      <w:proofErr w:type="spellStart"/>
+      <w:r>
+        <w:t>Wadō-ryū</w:t>
+      </w:r>
+      <w:proofErr w:type="spellEnd"/>
+      <w:r>
+        <w:t xml:space="preserve"> black belt and the chief instructor, though the children rarely used either title when he was close enough to touch. To them, he was simply Rohan: the enormous man who could correct a stance with two fingers, lift a crying child onto his shoulder, and make the hardest exercise feel like a secret they were learning together.</w:t>
+      </w:r>
+    </w:p>
+    <w:p>
+      <w:r>
+        <w:t xml:space="preserve">The children were too young to know what the other </w:t>
+      </w:r>
+      <w:proofErr w:type="spellStart"/>
+      <w:r>
+        <w:t>ganas</w:t>
+      </w:r>
+      <w:proofErr w:type="spellEnd"/>
+      <w:r>
+        <w:t xml:space="preserve"> believed about Ashoka. They did not know that Drona considered Ashoka blunt, that Chanakya considered it unsophisticated, or that Kubera preferred to see only the uniform and the force behind it. They knew the dojo floor, the red boundary marks, the discipline of a bowed head, and the difference between a strike that stopped a threat and a strike thrown to display power. When Rohan entered, they straightened at once. When he smiled, they forgot to remain solemn.</w:t>
+      </w:r>
+    </w:p>
+    <w:p>
+      <w:r>
+        <w:t xml:space="preserve">Rohan taught them an old Ashoka form called </w:t>
+      </w:r>
+      <w:proofErr w:type="spellStart"/>
+      <w:r>
+        <w:t>Wadō-ryū</w:t>
+      </w:r>
+      <w:proofErr w:type="spellEnd"/>
+      <w:r>
+        <w:t xml:space="preserve">, the Way of Peace and Harmony. The name confused visitors. Ashoka was supposed to be the </w:t>
+      </w:r>
+      <w:proofErr w:type="spellStart"/>
+      <w:r>
+        <w:t>gana</w:t>
+      </w:r>
+      <w:proofErr w:type="spellEnd"/>
+      <w:r>
+        <w:t xml:space="preserve"> of force. Its answer was that force without harmony was only fear wearing a uniform.</w:t>
       </w:r>
     </w:p>
     <w:p>
@@ -308,7 +478,31 @@
     </w:p>
     <w:p>
       <w:r>
-        <w:t>Ashoka respected all of them. It had chosen Wadō-ryū because its principles suited the duty the gana wanted to embody: evade before meeting force, preserve balance under pressure, protect the person in front of you, and make defense strong enough that violence became unnecessary whenever another choice remained. The best offense was not the first strike. It was the position that made the first strike unnecessary.</w:t>
+        <w:t xml:space="preserve">Ashoka respected all of them. It had chosen </w:t>
+      </w:r>
+      <w:proofErr w:type="spellStart"/>
+      <w:r>
+        <w:t>Wadō-ryū</w:t>
+      </w:r>
+      <w:proofErr w:type="spellEnd"/>
+      <w:r>
+        <w:t xml:space="preserve"> because its principles suited the duty the </w:t>
+      </w:r>
+      <w:proofErr w:type="spellStart"/>
+      <w:r>
+        <w:t>gana</w:t>
+      </w:r>
+      <w:proofErr w:type="spellEnd"/>
+      <w:r>
+        <w:t xml:space="preserve"> wanted to </w:t>
+      </w:r>
+      <w:proofErr w:type="gramStart"/>
+      <w:r>
+        <w:t>embody:</w:t>
+      </w:r>
+      <w:proofErr w:type="gramEnd"/>
+      <w:r>
+        <w:t xml:space="preserve"> evade before meeting force, preserve balance under pressure, protect the person in front of you, and make defense strong enough that violence became unnecessary whenever another choice remained. The best offense was not the first strike. It was the position that made the first strike unnecessary.</w:t>
       </w:r>
     </w:p>
     <w:p>
@@ -318,15 +512,310 @@
     </w:p>
     <w:p>
       <w:r>
-        <w:t>One child watched the door so closely that he forgot his own stance; Rohan taught him that a guardian who fell every time someone else stumbled could not hold a line. Another moved so quickly that she outran every correction; Rohan made her repeat the movement until she could stop her hand before contact, teaching her that power became discipline only when it could stop itself. A smaller child fell during every exercise but always stood, bowed, and tried again. A fourth obeyed every instruction until anothe</w:t>
-      </w:r>
-      <w:r>
-        <w:t>r child needed help, then broke formation to steady them. Rohan taught them all the same lesson: protection required balance, courage included recovery, and obedience without awareness was not guardianship.</w:t>
-      </w:r>
-    </w:p>
-    <w:p>
-      <w:r>
-        <w:t>The final sparring pair of the day was five-year-old Isha and seven-year-old Dev. Isha was the smallest child in the class, with a purple belt tied around her waist, one rank below brown. Dev wore a brown belt. He had longer arms, stronger legs, and the confidence of a boy who had never needed to wonder whether his body would obey him.</w:t>
+        <w:t xml:space="preserve">Tavi watched the door so closely that he forgot his own stance; Rohan taught him that a guardian who fell every time someone else stumbled could not hold a line. Meera moved so quickly that she outran every correction; Rohan made her repeat the movement until she could stop her hand before contact, teaching her that power became discipline only when it could stop itself. Niko fell during every exercise but always stood, bowed, and tried again. Arjun obeyed every instruction until another child needed help, </w:t>
+      </w:r>
+      <w:r>
+        <w:t xml:space="preserve">then broke formation to steady them. Rohan taught them all the same </w:t>
+      </w:r>
+      <w:proofErr w:type="gramStart"/>
+      <w:r>
+        <w:t>lesson</w:t>
+      </w:r>
+      <w:proofErr w:type="gramEnd"/>
+      <w:r>
+        <w:t>: protection required balance, courage included recovery, and obedience without awareness was not guardianship.</w:t>
+      </w:r>
+    </w:p>
+    <w:p>
+      <w:r>
+        <w:t>The final sparring pair of the day was five-year-old Claudia and seven-year-old Dev. Claudia was the smallest child in the class, with a purple belt tied around her waist, one rank below brown. Dev wore a brown belt. He had longer arms, stronger legs, and the confidence of a boy who had never needed to wonder whether his body would obey him.</w:t>
+      </w:r>
+    </w:p>
+    <w:p>
+      <w:r>
+        <w:t>Their sparring session was not a contest of force. Both wore padded gloves and chest guards. The rules were simple: controlled contact, no strikes to the head, no follow-up after a clean point, and an immediate bow whenever either partner lost balance. The purpose was to see what remained when a child was tired, surprised, and no longer certain of winning.</w:t>
+      </w:r>
+    </w:p>
+    <w:p>
+      <w:r>
+        <w:t>Dev scored first. He stepped around Claudia's guard and touched her chest pad with a clean straight punch. Claudia's eyes flashed with frustration, but she bowed and reset her feet.</w:t>
+      </w:r>
+    </w:p>
+    <w:p>
+      <w:r>
+        <w:t>He scored again.</w:t>
+      </w:r>
+    </w:p>
+    <w:p>
+      <w:r>
+        <w:t xml:space="preserve">Claudia stumbled backward, caught herself, and looked toward Rohan. He gave no </w:t>
+      </w:r>
+      <w:proofErr w:type="gramStart"/>
+      <w:r>
+        <w:t>instruction</w:t>
+      </w:r>
+      <w:proofErr w:type="gramEnd"/>
+      <w:r>
+        <w:t>. This was her examination; she had to find the next correct movement herself.</w:t>
+      </w:r>
+    </w:p>
+    <w:p>
+      <w:r>
+        <w:lastRenderedPageBreak/>
+        <w:t xml:space="preserve">Dev came forward a third </w:t>
+      </w:r>
+      <w:proofErr w:type="gramStart"/>
+      <w:r>
+        <w:t>time,</w:t>
+      </w:r>
+      <w:proofErr w:type="gramEnd"/>
+      <w:r>
+        <w:t xml:space="preserve"> certain he knew how Claudia would respond. Claudia moved aside instead of back. His glove passed her shoulder. She placed her palm against his ribs, light enough to show control and firm enough to count.</w:t>
+      </w:r>
+    </w:p>
+    <w:p>
+      <w:r>
+        <w:t>The point went to her.</w:t>
+      </w:r>
+    </w:p>
+    <w:p>
+      <w:r>
+        <w:t>Dev frowned. Claudia bowed.</w:t>
+      </w:r>
+    </w:p>
+    <w:p>
+      <w:r>
+        <w:t>He attacked harder, not illegally, but with the impatience of someone who wanted the exchange to end. Claudia's feet tangled. She fell to one knee. For a moment, the room went quiet. Dev stopped with his glove raised, and Claudia looked at the mat beneath her hand.</w:t>
+      </w:r>
+    </w:p>
+    <w:p>
+      <w:r>
+        <w:t xml:space="preserve">Rohan saw the decision arrive in her face. She could stay down and let the round end. She could </w:t>
+      </w:r>
+      <w:proofErr w:type="gramStart"/>
+      <w:r>
+        <w:t>rush up</w:t>
+      </w:r>
+      <w:proofErr w:type="gramEnd"/>
+      <w:r>
+        <w:t xml:space="preserve"> angry and turn the next exchange into a collision. Or she could breathe, recover her stance, and begin again.</w:t>
+      </w:r>
+    </w:p>
+    <w:p>
+      <w:r>
+        <w:t>Claudia breathed once.</w:t>
+      </w:r>
+    </w:p>
+    <w:p>
+      <w:r>
+        <w:t>Then she stood.</w:t>
+      </w:r>
+    </w:p>
+    <w:p>
+      <w:r>
+        <w:t>The next time Dev entered, she did not try to beat his strength. She borrowed his movement. Her forearm guided his strike past her shoulder, her foot shifted outside his line, and her open hand stopped against the center of his chest guard. She held the position for one breath, then withdrew before the point could become a shove.</w:t>
+      </w:r>
+    </w:p>
+    <w:p>
+      <w:r>
+        <w:t>Rohan raised his hand. "Enough."</w:t>
+      </w:r>
+    </w:p>
+    <w:p>
+      <w:r>
+        <w:t>Dev lowered his gloves. Claudia was breathing hard, her cheek flushed beneath the edge of her headguard, but she had not looked away from her partner.</w:t>
+      </w:r>
+    </w:p>
+    <w:p>
+      <w:r>
+        <w:t>"What did you learn?" Rohan asked Dev.</w:t>
+      </w:r>
+    </w:p>
+    <w:p>
+      <w:r>
+        <w:t>The boy glanced at Claudia. "That I was chasing the point."</w:t>
+      </w:r>
+    </w:p>
+    <w:p>
+      <w:r>
+        <w:t>Rohan nodded. "And you?" he asked Claudia.</w:t>
+      </w:r>
+    </w:p>
+    <w:p>
+      <w:r>
+        <w:t>She considered the question. "That falling is not the end of the lesson."</w:t>
+      </w:r>
+    </w:p>
+    <w:p>
+      <w:r>
+        <w:t>The other children watched her now, not because she had won, but because she had continued without becoming reckless. She had protected herself, protected Dev from a dangerous collision, and returned to the purpose of the exercise after frustration tried to replace it.</w:t>
+      </w:r>
+    </w:p>
+    <w:p>
+      <w:r>
+        <w:t>Rohan knelt before Claudia and untied the purple belt from her waist. He folded it once and placed it in her hands, then took a brown belt from the rack beside the mat. He wrapped it around her waist and tightened the knot at the center.</w:t>
+      </w:r>
+    </w:p>
+    <w:p>
+      <w:r>
+        <w:t>The class broke into applause. Dev clapped first, louder than anyone, and Claudia's face changed with the effort of trying not to smile.</w:t>
+      </w:r>
+    </w:p>
+    <w:p>
+      <w:r>
+        <w:lastRenderedPageBreak/>
+        <w:t xml:space="preserve">"You have completed the requirements," he said. "Not because you defeated Dev. You did not. You completed them because you kept your mind clear, your body under control, and your spirit willing to return to </w:t>
+      </w:r>
+      <w:proofErr w:type="gramStart"/>
+      <w:r>
+        <w:t>the work</w:t>
+      </w:r>
+      <w:proofErr w:type="gramEnd"/>
+      <w:r>
+        <w:t>."</w:t>
+      </w:r>
+    </w:p>
+    <w:p>
+      <w:r>
+        <w:t>Claudia looked down at the belt as if it had become heavier.</w:t>
+      </w:r>
+    </w:p>
+    <w:p>
+      <w:r>
+        <w:t>"Does that mean I am strong now?"</w:t>
+      </w:r>
+    </w:p>
+    <w:p>
+      <w:r>
+        <w:t>"It means you are responsible for what your strength does next."</w:t>
+      </w:r>
+    </w:p>
+    <w:p>
+      <w:r>
+        <w:t>That was the lesson Ashoka tried to preserve beneath every uniform and every weapon. The body could be powerful without becoming cruel. The mind had to remain clear when fear narrowed it. Spirit was not a distant mystery. It was the decision to keep strength answerable to a purpose.</w:t>
+      </w:r>
+    </w:p>
+    <w:p>
+      <w:r>
+        <w:t xml:space="preserve">The lesson had always been misunderstood outside Ashoka. The </w:t>
+      </w:r>
+      <w:proofErr w:type="spellStart"/>
+      <w:r>
+        <w:t>gana</w:t>
+      </w:r>
+      <w:proofErr w:type="spellEnd"/>
+      <w:r>
+        <w:t xml:space="preserve"> did not train aggressors. It trained defenders who could display violence only when violence was necessary, and restraint when it was not. Ashoka allowed other institutions to mistake discipline for simplicity. There was advantage in being underestimated. Beneath the hard rooms, the red uniforms, and the silence of its responders, the </w:t>
+      </w:r>
+      <w:proofErr w:type="spellStart"/>
+      <w:r>
+        <w:t>gana</w:t>
+      </w:r>
+      <w:proofErr w:type="spellEnd"/>
+      <w:r>
+        <w:t xml:space="preserve"> preserved an intellectual tradition of judgment, proportion, and responsibility that few outsiders had bothered to study.</w:t>
+      </w:r>
+    </w:p>
+    <w:p>
+      <w:r>
+        <w:t>When the class ended, the children bowed. Then discipline dissolved into affection. Niko ran into Rohan's legs first. Tavi wrapped both arms around his waist. Meera and Arjun joined from either side, and Dev, after a moment of pretending he was too old for such things, pressed into the embrace as well. Claudia stood back with her new brown belt, trying to look composed until Rohan opened one arm toward her.</w:t>
+      </w:r>
+    </w:p>
+    <w:p>
+      <w:r>
+        <w:t>She stepped into it.</w:t>
+      </w:r>
+    </w:p>
+    <w:p>
+      <w:r>
+        <w:t>For several seconds, the chief instructor stood surrounded by small arms and warm bodies, a broad, immovable shape the children treated like a beloved bear who happened to know how to stop a fight. Rohan rested his hands lightly across their backs, careful not to hold too tightly. They respected him because he was strong. They loved him because he never made them afraid of that strength.</w:t>
+      </w:r>
+    </w:p>
+    <w:p>
+      <w:r>
+        <w:t>Only after he promised to see them at the next lesson did the children let him go.</w:t>
+      </w:r>
+    </w:p>
+    <w:p>
+      <w:r>
+        <w:t>Later, in his quarters, Rohan stood by the narrow window and looked across the training court at Ashoka's red platforms. The city looked stable from above. Stability was one of Trinity's most convincing illusions.</w:t>
+      </w:r>
+    </w:p>
+    <w:p>
+      <w:r>
+        <w:t>He thought of Elara's hand moving across the record. She had not thrown the first strike. She had stepped into the line of force and redirected it before it reached the boys.</w:t>
+      </w:r>
+    </w:p>
+    <w:p>
+      <w:r>
+        <w:lastRenderedPageBreak/>
+        <w:t>The comparison did not make her action authorized. It made it harder to call the action wrong.</w:t>
+      </w:r>
+    </w:p>
+    <w:p>
+      <w:r>
+        <w:t xml:space="preserve">That evening, Rohan decided to ask the Grandmaster for her counsel. He needed guidance that did not come from a report, a protocol, or a </w:t>
+      </w:r>
+      <w:proofErr w:type="gramStart"/>
+      <w:r>
+        <w:t>frightened</w:t>
+      </w:r>
+      <w:proofErr w:type="gramEnd"/>
+      <w:r>
+        <w:t xml:space="preserve"> interpretation of what the other </w:t>
+      </w:r>
+      <w:proofErr w:type="spellStart"/>
+      <w:r>
+        <w:t>ganas</w:t>
+      </w:r>
+      <w:proofErr w:type="spellEnd"/>
+      <w:r>
+        <w:t xml:space="preserve"> might do. He needed to know whether Ashoka could uphold a just act of courage by a Drona monitor without turning justice into interference or protection into another claim of power.</w:t>
+      </w:r>
+    </w:p>
+    <w:p>
+      <w:r>
+        <w:t>The decision brought its own difficulty. The Grandmaster's schedule was built months in advance. A request for a private audience could wait for weeks unless the matter carried an urgency the institution was willing to recognize. Rohan would submit the request in the morning. Until then, he could do nothing but sleep and trust that the question would remain clear when he woke.</w:t>
+      </w:r>
+    </w:p>
+    <w:p>
+      <w:r>
+        <w:t>He had just turned down the lights when his room panel opened without a chime.</w:t>
+      </w:r>
+    </w:p>
+    <w:p>
+      <w:r>
+        <w:t>ASHOKA CEREMONIAL OBSERVATION.</w:t>
+      </w:r>
+    </w:p>
+    <w:p>
+      <w:r>
+        <w:t>GRANDMASTER ASCENSION: EIGHTH DAN.</w:t>
+      </w:r>
+    </w:p>
+    <w:p>
+      <w:r>
+        <w:t>ATTENDANCE REQUESTED.</w:t>
+      </w:r>
+    </w:p>
+    <w:p>
+      <w:r>
+        <w:t>The message carried no explanation. It did not need one. The Grandmaster's ascension to the eighth dan was not an ordinary promotion. It was a ceremony of state, attended by key civic leaders, generals from the defense divisions, senior Ashoka commanders, and strategists whose decisions shaped the security of Trinity-1 long before those decisions became public policy.</w:t>
+      </w:r>
+    </w:p>
+    <w:p>
+      <w:r>
+        <w:t>Rohan read the message twice. His request for counsel had not yet been sent, but the answer had arrived before the question.</w:t>
+      </w:r>
+    </w:p>
+    <w:p>
+      <w:r>
+        <w:t>He sat on the edge of his bed in a plain dark shirt and training trousers. Why had he been invited? He was a senior responder and an Initiation monitor, but he was not a general, a minister, or a strategist whose decisions shaped the city's defense. The message had arrived too quickly to be routine and without enough explanation to be harmless. It was another mystery, placed in his hands just when he had decided to ask the Grandmaster for guidance.</w:t>
+      </w:r>
+    </w:p>
+    <w:p>
+      <w:r>
+        <w:t>He lay down with the question still open. Sleep took him before he could close it.</w:t>
       </w:r>
     </w:p>
     <w:p>
@@ -334,383 +823,235 @@
         <w:rPr>
           <w:highlight w:val="yellow"/>
         </w:rPr>
-        <w:t>Their sparring session was not a contest of force. Both wore padded gloves and chest guards. The rules were simple: controlled contact, no strikes to the head, no follow-up after a clean point, and an immediate bow whenever either partner lost balance. The purpose was to see what remained when a child was tired, surprised, and no longer certain of winning.</w:t>
-      </w:r>
-    </w:p>
-    <w:p>
-      <w:r>
-        <w:t>Dev scored first. He stepped around Isha's guard and touched her chest pad with a clean straight punch. Isha's eyes flashed with frustration, but she bowed and reset her feet.</w:t>
-      </w:r>
-    </w:p>
-    <w:p>
-      <w:r>
-        <w:t>He scored again.</w:t>
-      </w:r>
-    </w:p>
-    <w:p>
-      <w:r>
-        <w:t>Isha stumbled backward, caught herself, and looked toward Rohan. He did not give her an answer. Wadō-ryū did not ask an instructor to rescue a student from difficulty. It asked the student to find the next correct movement.</w:t>
-      </w:r>
-    </w:p>
-    <w:p>
+        <w:t>At exactly 4:00 a.m., his room panel brightened.</w:t>
+      </w:r>
+    </w:p>
+    <w:p>
+      <w:r>
+        <w:t xml:space="preserve">Rohan woke before the second tone. He rose, washed, and dressed </w:t>
+      </w:r>
+      <w:proofErr w:type="gramStart"/>
+      <w:r>
+        <w:t>with</w:t>
+      </w:r>
+      <w:proofErr w:type="gramEnd"/>
+      <w:r>
+        <w:t xml:space="preserve"> the care the occasion required. He wore the traditional Ashoka </w:t>
+      </w:r>
+      <w:proofErr w:type="spellStart"/>
+      <w:r>
+        <w:t>Wadō-ryū</w:t>
+      </w:r>
+      <w:proofErr w:type="spellEnd"/>
+      <w:r>
+        <w:t xml:space="preserve"> kimono: deep red cloth, black trim, a white belt, and the </w:t>
+      </w:r>
+      <w:proofErr w:type="gramStart"/>
+      <w:r>
+        <w:t>small embroidered</w:t>
+      </w:r>
+      <w:proofErr w:type="gramEnd"/>
+      <w:r>
+        <w:t xml:space="preserve"> insignia positioned over his heart. He checked the fold of the collar, the knot at his waist, and the fall of the sleeves. Today he would stand among people who moved armies, directed divisions, and decided which dangers the public </w:t>
+      </w:r>
       <w:r>
         <w:lastRenderedPageBreak/>
-        <w:t>Dev came forward a third time, certain the pattern had been solved. Isha moved aside instead of back. His glove passed her shoulder. She placed her palm against his ribs, light enough to show control and firm enough to count.</w:t>
-      </w:r>
-    </w:p>
-    <w:p>
-      <w:r>
-        <w:t>The point went to her.</w:t>
-      </w:r>
-    </w:p>
-    <w:p>
-      <w:r>
-        <w:t>Dev frowned. Isha bowed.</w:t>
-      </w:r>
-    </w:p>
-    <w:p>
-      <w:r>
-        <w:t>He attacked harder, not illegally, but with the impatience of someone who wanted the exchange to end. Isha's feet tangled. She fell to one knee. For a moment, the room went quiet. Dev stopped with his glove raised, and Isha looked at the mat beneath her hand.</w:t>
-      </w:r>
-    </w:p>
-    <w:p>
-      <w:r>
-        <w:t>Rohan saw the decision arrive in her face. She could stay down and let the round end. She could rush up angry and turn the next exchange into a collision. Or she could breathe, recover her stance, and begin again.</w:t>
-      </w:r>
-    </w:p>
-    <w:p>
-      <w:r>
-        <w:t>Isha breathed once.</w:t>
-      </w:r>
-    </w:p>
-    <w:p>
-      <w:r>
-        <w:t>Then she stood.</w:t>
-      </w:r>
-    </w:p>
-    <w:p>
-      <w:r>
-        <w:t>The next time Dev entered, she did not try to beat his strength. She borrowed his movement. Her forearm guided his strike past her shoulder, her foot shifted outside his line, and her open hand stopped against the center of his chest guard. She held the position for one breath, then withdrew before the point could become a shove.</w:t>
-      </w:r>
-    </w:p>
-    <w:p>
-      <w:r>
-        <w:t>Rohan raised his hand. "Enough."</w:t>
-      </w:r>
-    </w:p>
-    <w:p>
-      <w:r>
-        <w:t>Dev lowered his gloves. Isha was breathing hard, her cheek flushed beneath the edge of her headguard, but she had not looked away from her partner.</w:t>
-      </w:r>
-    </w:p>
-    <w:p>
-      <w:r>
-        <w:t>"What did you learn?" Rohan asked Dev.</w:t>
-      </w:r>
-    </w:p>
-    <w:p>
-      <w:r>
-        <w:t>The boy glanced at Isha. "That I was chasing the point."</w:t>
-      </w:r>
-    </w:p>
-    <w:p>
-      <w:r>
-        <w:t>Rohan nodded. "And you?" he asked Isha.</w:t>
-      </w:r>
-    </w:p>
-    <w:p>
-      <w:r>
-        <w:t>She considered the question. "That falling is not the end of the lesson."</w:t>
-      </w:r>
-    </w:p>
-    <w:p>
-      <w:r>
-        <w:t>The other children watched her now, not because she had won, but because she had continued without becoming reckless. She had protected herself, protected Dev from a dangerous collision, and returned to the purpose of the exercise after frustration tried to replace it.</w:t>
-      </w:r>
-    </w:p>
-    <w:p>
-      <w:r>
-        <w:t>Rohan untied the brown belt from her waist and retied it more carefully, tightening the knot at the center.</w:t>
-      </w:r>
-    </w:p>
-    <w:p>
-      <w:r>
-        <w:t>"You have completed the requirements," he said. "Not because you defeated Dev. You did not. You completed them because you kept your mind clear, your body under control, and your spirit willing to return to the work."</w:t>
+        <w:t>was permitted to know. He would not arrive looking as though he had been surprised into importance.</w:t>
+      </w:r>
+    </w:p>
+    <w:p>
+      <w:r>
+        <w:t>By dawn, the ceremony filled Ashoka's central hall. Red standards hung from the upper galleries. Generals stood in formal rows beneath the insignias of their divisions. Ministers, state leaders, and strategic advisers occupied the front tiers, their presence turning a martial promotion into a public statement about who was trusted to hold power.</w:t>
+      </w:r>
+    </w:p>
+    <w:p>
+      <w:r>
+        <w:t>The Grandmaster entered without procession. The hall quieted anyway.</w:t>
+      </w:r>
+    </w:p>
+    <w:p>
+      <w:r>
+        <w:t xml:space="preserve">The ascension was not presented as a reward for victory. The eighth dan represented the ability to carry force without being carried away by it: mastery of body, mind, spirit, and consequence. The final demonstration was brief. The Grandmaster redirected an advancing instructor, broke the line of attack, and stopped with her hand resting against the opponent's shoulder. She could have </w:t>
+      </w:r>
+      <w:proofErr w:type="gramStart"/>
+      <w:r>
+        <w:t>struck</w:t>
+      </w:r>
+      <w:proofErr w:type="gramEnd"/>
+      <w:r>
+        <w:t>. The ceremony required everyone to understand that she had chosen not to.</w:t>
+      </w:r>
+    </w:p>
+    <w:p>
+      <w:r>
+        <w:t xml:space="preserve">Rohan watched the assembled leaders applaud. He thought of Elara at her console, making the same kind of decision in a room that had offered her no ceremony and no witness willing to defend her. The Grandmaster's achievement was mastery recognized by the state. Elara's had been </w:t>
+      </w:r>
+      <w:proofErr w:type="gramStart"/>
+      <w:r>
+        <w:t>judgment exercised</w:t>
+      </w:r>
+      <w:proofErr w:type="gramEnd"/>
+      <w:r>
+        <w:t xml:space="preserve"> without permission.</w:t>
+      </w:r>
+    </w:p>
+    <w:p>
+      <w:r>
+        <w:t>Then the ceremony changed.</w:t>
+      </w:r>
+    </w:p>
+    <w:p>
+      <w:r>
+        <w:t xml:space="preserve">The Grandmaster remained at the center of the dojo while the state leaders and generals took their seats around the perimeter. The eighth-dan candidacy was not decided by applause. It required a final examination before the oldest authority </w:t>
+      </w:r>
+      <w:proofErr w:type="spellStart"/>
+      <w:r>
+        <w:t>Wadō-ryū</w:t>
+      </w:r>
+      <w:proofErr w:type="spellEnd"/>
+      <w:r>
+        <w:t xml:space="preserve"> still recognized.</w:t>
+      </w:r>
+    </w:p>
+    <w:p>
+      <w:r>
+        <w:t>At the far end of the floor, an interior door opened.</w:t>
+      </w:r>
+    </w:p>
+    <w:p>
+      <w:r>
+        <w:t>Master Vayun entered without an escort.</w:t>
+      </w:r>
+    </w:p>
+    <w:p>
+      <w:r>
+        <w:t>He was ancient in the way mountains were ancient: not frail, not slow, but stripped of everything unnecessary. His hair fell white to his shoulders. His face was narrow and deeply lined, the skin drawn tight over high cheekbones and a jaw that seemed carved rather than grown. He wore a plain ivory kimono with no crest, no decoration, and no belt rank visible from a distance. His hands hung loosely at his sides.</w:t>
+      </w:r>
+    </w:p>
+    <w:p>
+      <w:r>
+        <w:t>Then he moved across the floor.</w:t>
+      </w:r>
+    </w:p>
+    <w:p>
+      <w:r>
+        <w:t xml:space="preserve">The impression of age vanished. He crossed the distance without appearing to hurry, his feet sliding over the boards with such </w:t>
+      </w:r>
+      <w:proofErr w:type="gramStart"/>
+      <w:r>
+        <w:t>economy</w:t>
+      </w:r>
+      <w:proofErr w:type="gramEnd"/>
+      <w:r>
+        <w:t xml:space="preserve"> that the body seemed to arrive before the motion had begun. He was small beside the Grandmaster, but the entire hall adjusted around him. Generals stopped whispering. Strategists lowered their tablets. Even the state leaders watched with the careful attention of people who understood that the old man could cross a room before any guard had time to decide whether he was dangerous.</w:t>
       </w:r>
     </w:p>
     <w:p>
       <w:r>
         <w:lastRenderedPageBreak/>
-        <w:t>Isha looked down at the belt as if it had become heavier.</w:t>
-      </w:r>
-    </w:p>
-    <w:p>
-      <w:r>
-        <w:t>"Does that mean I am strong now?"</w:t>
-      </w:r>
-    </w:p>
-    <w:p>
-      <w:r>
-        <w:t>"It means you are responsible for what your strength does next."</w:t>
-      </w:r>
-    </w:p>
-    <w:p>
-      <w:r>
-        <w:t>That was the lesson Ashoka tried to preserve beneath every uniform and every weapon. The body could be powerful without becoming cruel. The mind had to remain clear when fear narrowed it. Spirit was not a distant mystery. It was the decision to keep strength answerable to a purpose.</w:t>
-      </w:r>
-    </w:p>
-    <w:p>
-      <w:r>
-        <w:t>The lesson had always been misunderstood outside Ashoka. The gana did not train aggressors. It trained defenders who could display violence only when violence was necessary, and restraint when it was not. Ashoka allowed other institutions to mistake discipline for simplicity. There was advantage in being underestimated. Beneath the hard rooms, the red uniforms, and the silence of its responders, the gana preserved an intellectual tradition of judgment, proportion, and responsibility that few outsiders had b</w:t>
-      </w:r>
-      <w:r>
-        <w:t>othered to study.</w:t>
-      </w:r>
-    </w:p>
-    <w:p>
-      <w:r>
-        <w:t>When the class ended, the children bowed. Then discipline dissolved into affection. Niko ran into Rohan's legs first. Tavi wrapped both arms around his waist. Meera and Arjun joined from either side, and Dev, after a moment of pretending he was too old for such things, pressed into the embrace as well. Isha stood back with her new brown belt, trying to look composed until Rohan opened one arm toward her.</w:t>
-      </w:r>
-    </w:p>
-    <w:p>
-      <w:r>
-        <w:t>She stepped into it.</w:t>
-      </w:r>
-    </w:p>
-    <w:p>
-      <w:r>
-        <w:t>For several seconds, the chief instructor stood surrounded by small arms and warm bodies, a broad, immovable shape the children treated like a beloved bear who happened to know how to stop a fight. Rohan rested his hands lightly across their backs, careful not to hold too tightly. They respected him because he was strong. They loved him because he never made them afraid of that strength.</w:t>
-      </w:r>
-    </w:p>
-    <w:p>
-      <w:r>
-        <w:t>Only after he promised to see them at the next lesson did the children let him go. Rohan remained by the window after they had gone, looking across the training court at the red lights of Ashoka's platforms. The city looked stable from above. Stability was one of Trinity's most convincing illusions.</w:t>
-      </w:r>
-    </w:p>
-    <w:p>
-      <w:r>
-        <w:t>He thought of Elara's hand moving across the record. She had not thrown the first strike. She had stepped into the line of force and redirected it before it reached the boys.</w:t>
-      </w:r>
-    </w:p>
-    <w:p>
-      <w:r>
-        <w:t>The comparison did not make her action authorized. It made it harder to call the action wrong.</w:t>
-      </w:r>
-    </w:p>
-    <w:p>
-      <w:r>
-        <w:t xml:space="preserve">That evening, Rohan decided to ask the Grandmaster for her counsel. He needed guidance that did not come from a report, a protocol, or a frightened interpretation of what the other ganas might do. He needed to know how Ashoka could protect the boys without turning </w:t>
-      </w:r>
+        <w:t xml:space="preserve">Master Vayun was the presiding tenth-dan practitioner of </w:t>
+      </w:r>
+      <w:proofErr w:type="spellStart"/>
+      <w:r>
+        <w:t>Wadō-ryū</w:t>
+      </w:r>
+      <w:proofErr w:type="spellEnd"/>
+      <w:r>
+        <w:t>, the last living master permitted to judge whether a candidate understood the art beyond its movements. He had trained responders before Ashoka's modern divisions existed. Some said he had never lost a full-contact bout. Others said that was the wrong measure, because he had ended every serious encounter before it became a bout at all.</w:t>
+      </w:r>
+    </w:p>
+    <w:p>
+      <w:r>
+        <w:t>Rohan had seen him only in old recordings.</w:t>
+      </w:r>
+    </w:p>
+    <w:p>
+      <w:r>
+        <w:t>He had not expected to be in the same room.</w:t>
+      </w:r>
+    </w:p>
+    <w:p>
+      <w:r>
+        <w:t>Rohan moved to the back row, where junior instructors and senior students had been placed. His second-dan black belt made him senior enough to be recognized, but not important enough to expect a place near the examination floor. He sat with his hands resting on his knees, careful not to draw attention. The hall was too grand for him to feel like a participant. It was filled with national ministers, defense generals, division commanders, and strategic leaders whose decisions could close a city gate or redire</w:t>
+      </w:r>
+      <w:r>
+        <w:t>ct an entire response force.</w:t>
+      </w:r>
+    </w:p>
+    <w:p>
+      <w:r>
+        <w:t xml:space="preserve">A volunteer student approached him during the silence before the examination. She was dressed in </w:t>
+      </w:r>
+      <w:proofErr w:type="gramStart"/>
+      <w:r>
+        <w:t>white,</w:t>
+      </w:r>
+      <w:proofErr w:type="gramEnd"/>
+      <w:r>
+        <w:t xml:space="preserve"> her brown belt tied neatly </w:t>
+      </w:r>
+      <w:proofErr w:type="gramStart"/>
+      <w:r>
+        <w:t>at</w:t>
+      </w:r>
+      <w:proofErr w:type="gramEnd"/>
+      <w:r>
+        <w:t xml:space="preserve"> her waist.</w:t>
+      </w:r>
+    </w:p>
+    <w:p>
+      <w:r>
+        <w:t>"Chief Instructor Rohan?" she whispered.</w:t>
+      </w:r>
+    </w:p>
+    <w:p>
+      <w:r>
+        <w:t>He looked up. "Yes?"</w:t>
+      </w:r>
+    </w:p>
+    <w:p>
+      <w:r>
+        <w:t>She bowed. "Master Vayun requests that you join him in the front row."</w:t>
+      </w:r>
+    </w:p>
+    <w:p>
+      <w:r>
+        <w:t>Rohan glanced toward the floor. Master Vayun stood beside the Grandmaster, apparently looking at nothing. The request made no sense. Rohan was not a tenth-dan practitioner, a state leader, or a member of the examination council. He had come to observe.</w:t>
+      </w:r>
+    </w:p>
+    <w:p>
+      <w:r>
+        <w:t>"Are you certain?" he asked.</w:t>
+      </w:r>
+    </w:p>
+    <w:p>
+      <w:r>
+        <w:t>The student smiled with the patience of someone delivering an instruction she had no intention of debating. "He used your name."</w:t>
+      </w:r>
+    </w:p>
+    <w:p>
+      <w:r>
+        <w:t>Rohan rose.</w:t>
+      </w:r>
+    </w:p>
+    <w:p>
+      <w:r>
+        <w:t>The walk to the front of the dojo seemed longer than the entire hall. Every step carried him past people who had spent decades deciding where power belonged. He felt their attention turn toward him, not hostile, but precise. He bowed first to the Grandmaster, then to Master Vayun.</w:t>
+      </w:r>
+    </w:p>
+    <w:p>
+      <w:r>
+        <w:t>Up close, the old master was even more striking. His eyes were dark and bright beneath heavy brows, alert with an almost unsettling youth. His shoulders were narrow, his body spare, but the stillness inside him felt compressed rather than diminished. He looked like someone who had spent a lifetime removing weakness from every movement until even breathing had become a form of discipline.</w:t>
+      </w:r>
+    </w:p>
+    <w:p>
       <w:r>
         <w:lastRenderedPageBreak/>
-        <w:t>protection into interference, and how a guardian could act before danger became large enough to justify force.</w:t>
-      </w:r>
-    </w:p>
-    <w:p>
-      <w:r>
-        <w:t>The decision brought its own difficulty. The Grandmaster's schedule was built months in advance. A request for a private audience could wait for weeks unless the matter carried an urgency the institution was willing to recognize. Rohan would submit the request in the morning. Until then, he could do nothing but sleep and trust that the question would remain clear when he woke.</w:t>
-      </w:r>
-    </w:p>
-    <w:p>
-      <w:r>
-        <w:t>He had just turned down the lights when his room panel opened without a chime.</w:t>
-      </w:r>
-    </w:p>
-    <w:p>
-      <w:r>
-        <w:t>ASHOKA CEREMONIAL OBSERVATION.</w:t>
-      </w:r>
-    </w:p>
-    <w:p>
-      <w:r>
-        <w:t>GRANDMASTER ASCENSION: EIGHTH DAN.</w:t>
-      </w:r>
-    </w:p>
-    <w:p>
-      <w:r>
-        <w:t>ATTENDANCE REQUESTED.</w:t>
-      </w:r>
-    </w:p>
-    <w:p>
-      <w:r>
-        <w:t>The message carried no explanation. It did not need one. The Grandmaster's ascension to the eighth dan was not an ordinary promotion. It was a ceremony of state, attended by key civic leaders, generals from the defense divisions, senior Ashoka commanders, and strategists whose decisions shaped the security of Trinity-1 long before those decisions became public policy.</w:t>
-      </w:r>
-    </w:p>
-    <w:p>
-      <w:r>
-        <w:t>Rohan read the message twice. His request for counsel had not yet been sent, but the answer had arrived before the question.</w:t>
-      </w:r>
-    </w:p>
-    <w:p>
-      <w:r>
-        <w:t>He sat on the edge of his bed without removing his uniform jacket. Why had he been invited? He was a senior responder and the chief instructor of the Little Dragons, but he was not a general, a minister, or a strategist whose decisions shaped the city's defense. The message had arrived too quickly to be routine and without enough explanation to be harmless. It was another mystery, placed in his hands just when he had decided to ask the Grandmaster for guidance.</w:t>
-      </w:r>
-    </w:p>
-    <w:p>
-      <w:r>
-        <w:t>He lay down with the question still open. Sleep took him before he could close it.</w:t>
-      </w:r>
-    </w:p>
-    <w:p>
-      <w:r>
-        <w:t>At exactly 4:00 a.m., his room panel brightened.</w:t>
-      </w:r>
-    </w:p>
-    <w:p>
-      <w:r>
-        <w:t>Rohan woke before the second tone. He rose, washed, and dressed with the care the occasion required. He wore the traditional Ashoka Wadō-ryū kimono: deep red cloth, black trim, a white belt, and the small embroidered insignia positioned over his heart. He checked the fold of the collar, the knot at his waist, and the fall of the sleeves. Today he would stand among people who moved armies, directed divisions, and decided which dangers the public was permitted to know. He would not arrive looking as though he</w:t>
-      </w:r>
-      <w:r>
-        <w:t xml:space="preserve"> had been surprised into importance.</w:t>
-      </w:r>
-    </w:p>
-    <w:p>
-      <w:r>
-        <w:t xml:space="preserve">By dawn, the ceremony filled Ashoka's central hall. Red standards hung from the upper galleries. Generals stood in formal rows beneath the insignias of their divisions. Ministers, </w:t>
-      </w:r>
-      <w:r>
-        <w:lastRenderedPageBreak/>
-        <w:t>state leaders, and strategic advisers occupied the front tiers, their presence turning a martial promotion into a public statement about who was trusted to hold power.</w:t>
-      </w:r>
-    </w:p>
-    <w:p>
-      <w:r>
-        <w:t>The Grandmaster entered without procession. The hall quieted anyway.</w:t>
-      </w:r>
-    </w:p>
-    <w:p>
-      <w:r>
-        <w:t>The ascension was not presented as a reward for victory. The eighth dan represented the ability to carry force without being carried away by it: mastery of body, mind, spirit, and consequence. The final demonstration was brief. The Grandmaster redirected an advancing instructor, broke the line of attack, and stopped with her hand resting against the opponent's shoulder. She could have struck. The ceremony required everyone to understand that she had chosen not to.</w:t>
-      </w:r>
-    </w:p>
-    <w:p>
-      <w:r>
-        <w:t>Rohan watched the assembled leaders applaud. He thought of Elara at her console, making the same kind of decision in a room that had offered her no ceremony and no witness willing to defend her. The Grandmaster's achievement was mastery recognized by the state. Elara's had been judgment exercised without permission.</w:t>
-      </w:r>
-    </w:p>
-    <w:p>
-      <w:r>
-        <w:t>Then the ceremony changed.</w:t>
-      </w:r>
-    </w:p>
-    <w:p>
-      <w:r>
-        <w:t>The Grandmaster remained at the center of the dojo while the state leaders and generals took their seats around the perimeter. The eighth-dan candidacy was not decided by applause. It required a final examination before the oldest authority Wadō-ryū still recognized.</w:t>
-      </w:r>
-    </w:p>
-    <w:p>
-      <w:r>
-        <w:t>At the far end of the floor, an interior door opened.</w:t>
-      </w:r>
-    </w:p>
-    <w:p>
-      <w:r>
-        <w:t>Master Vayun entered without an escort.</w:t>
-      </w:r>
-    </w:p>
-    <w:p>
-      <w:r>
-        <w:t>He was ancient in the way mountains were ancient: not frail, not slow, but stripped of everything unnecessary. His hair fell white to his shoulders. His face was narrow and deeply lined, the skin drawn tight over high cheekbones and a jaw that seemed carved rather than grown. He wore a plain ivory kimono with no crest, no decoration, and no belt rank visible from a distance. His hands hung loosely at his sides.</w:t>
-      </w:r>
-    </w:p>
-    <w:p>
-      <w:r>
-        <w:t>Then he moved across the floor.</w:t>
-      </w:r>
-    </w:p>
-    <w:p>
-      <w:r>
-        <w:t>The impression of age vanished. He crossed the distance without appearing to hurry, his feet sliding over the boards with such economy that the body seemed to arrive before the motion had begun. He was small beside the Grandmaster, but the entire hall adjusted around him. Generals stopped whispering. Strategists lowered their tablets. Even the state leaders watched with the careful attention of people who understood that the old man could cross a room before any guard had time to decide whether he was dange</w:t>
-      </w:r>
-      <w:r>
-        <w:t>rous.</w:t>
-      </w:r>
-    </w:p>
-    <w:p>
-      <w:r>
-        <w:t xml:space="preserve">Master Vayun was the presiding tenth-dan practitioner of Wadō-ryū, the last living master permitted to judge whether a candidate understood the art beyond its movements. He had trained responders before Ashoka's modern divisions existed. Some said he had never lost a </w:t>
-      </w:r>
-      <w:r>
-        <w:lastRenderedPageBreak/>
-        <w:t>full-contact bout. Others said that was the wrong measure, because he had ended every serious encounter before it became a bout at all.</w:t>
-      </w:r>
-    </w:p>
-    <w:p>
-      <w:r>
-        <w:t>Rohan had seen him only in old recordings.</w:t>
-      </w:r>
-    </w:p>
-    <w:p>
-      <w:r>
-        <w:t>He had not expected to be in the same room.</w:t>
-      </w:r>
-    </w:p>
-    <w:p>
-      <w:r>
-        <w:t>Rohan moved to the back row, where junior instructors and senior students had been placed. His second-dan black belt made him senior enough to be recognized, but not important enough to expect a place near the examination floor. He sat with his hands resting on his knees, careful not to draw attention. The hall was too grand for him to feel like a participant. It was filled with national ministers, defense generals, division commanders, and strategic leaders whose decisions could close a city gate or redire</w:t>
-      </w:r>
-      <w:r>
-        <w:t>ct an entire response force.</w:t>
-      </w:r>
-    </w:p>
-    <w:p>
-      <w:r>
-        <w:t>A volunteer student approached him during the silence before the examination. She was dressed in white, her brown belt tied neatly at her waist.</w:t>
-      </w:r>
-    </w:p>
-    <w:p>
-      <w:r>
-        <w:t>"Chief Instructor Rohan?" she whispered.</w:t>
-      </w:r>
-    </w:p>
-    <w:p>
-      <w:r>
-        <w:t>He looked up. "Yes?"</w:t>
-      </w:r>
-    </w:p>
-    <w:p>
-      <w:r>
-        <w:t>She bowed. "Master Vayun requests that you join him in the front row."</w:t>
-      </w:r>
-    </w:p>
-    <w:p>
-      <w:r>
-        <w:t>Rohan glanced toward the floor. Master Vayun stood beside the Grandmaster, apparently looking at nothing. The request made no sense. Rohan was not a tenth-dan practitioner, a state leader, or a member of the examination council. He had come to observe.</w:t>
-      </w:r>
-    </w:p>
-    <w:p>
-      <w:r>
-        <w:t>"Are you certain?" he asked.</w:t>
-      </w:r>
-    </w:p>
-    <w:p>
-      <w:r>
-        <w:t>The student smiled with the patience of someone delivering an instruction she had no intention of debating. "He used your name."</w:t>
-      </w:r>
-    </w:p>
-    <w:p>
-      <w:r>
-        <w:t>Rohan rose.</w:t>
-      </w:r>
-    </w:p>
-    <w:p>
-      <w:r>
-        <w:t>The walk to the front of the dojo seemed longer than the entire hall. Every step carried him past people who had spent decades deciding where power belonged. He felt their attention turn toward him, not hostile, but precise. He bowed first to the Grandmaster, then to Master Vayun.</w:t>
-      </w:r>
-    </w:p>
-    <w:p>
-      <w:r>
-        <w:t>Up close, the old master was even more striking. His eyes were dark and bright beneath heavy brows, alert with an almost unsettling youth. His shoulders were narrow, his body spare, but the stillness inside him felt compressed rather than diminished. He looked like someone who had spent a lifetime removing weakness from every movement until even breathing had become a form of discipline.</w:t>
-      </w:r>
-    </w:p>
-    <w:p>
-      <w:r>
         <w:t>Master Vayun returned the bow with a slight inclination of his head.</w:t>
       </w:r>
     </w:p>
     <w:p>
       <w:r>
-        <w:lastRenderedPageBreak/>
         <w:t>"Rohan," he said.</w:t>
       </w:r>
     </w:p>

</xml_diff>

<commit_message>
Add Chamber of Spirits chapter
</commit_message>
<xml_diff>
--- a/manuscript/chapter-15-the-guardians.docx
+++ b/manuscript/chapter-15-the-guardians.docx
@@ -22,15 +22,7 @@
     </w:p>
     <w:p>
       <w:r>
-        <w:t xml:space="preserve">The silent version made the choices easier to see. Gage dividing his ration. Ben turning toward the injured. Otto moving before the force ladder could decide what his movement meant. The three of them </w:t>
-      </w:r>
-      <w:proofErr w:type="gramStart"/>
-      <w:r>
-        <w:t>refusing</w:t>
-      </w:r>
-      <w:proofErr w:type="gramEnd"/>
-      <w:r>
-        <w:t xml:space="preserve"> the shape the system had prepared for them.</w:t>
+        <w:t>The silent version made the choices easier to see. Gage dividing his ration. Ben turning toward the injured. Otto moving before the force ladder could decide what his movement meant. The three of them refusing the shape the system had prepared for them.</w:t>
       </w:r>
     </w:p>
     <w:p>
@@ -60,15 +52,7 @@
     </w:p>
     <w:p>
       <w:r>
-        <w:t xml:space="preserve">On the first review, her decision looked like personal judgment. She had seen three boys she could not bear to surrender to a procedure and had acted according to the truth she felt in </w:t>
-      </w:r>
-      <w:proofErr w:type="gramStart"/>
-      <w:r>
-        <w:t>the</w:t>
-      </w:r>
-      <w:proofErr w:type="gramEnd"/>
-      <w:r>
-        <w:t xml:space="preserve"> moment. That was not the same as authorization. It was not the same as law. It was not the same as proof.</w:t>
+        <w:t>On the first review, her decision looked like personal judgment. She had seen three boys she could not bear to surrender to a procedure and had acted according to the truth she felt in the moment. That was not the same as authorization. It was not the same as law. It was not the same as proof.</w:t>
       </w:r>
     </w:p>
     <w:p>
@@ -78,15 +62,7 @@
     </w:p>
     <w:p>
       <w:r>
-        <w:t xml:space="preserve">On the second review, the distinction </w:t>
-      </w:r>
-      <w:proofErr w:type="gramStart"/>
-      <w:r>
-        <w:t>held</w:t>
-      </w:r>
-      <w:proofErr w:type="gramEnd"/>
-      <w:r>
-        <w:t>.</w:t>
+        <w:t>On the second review, the distinction held.</w:t>
       </w:r>
     </w:p>
     <w:p>
@@ -96,15 +72,7 @@
     </w:p>
     <w:p>
       <w:r>
-        <w:t xml:space="preserve">Elara had not protected the boys because she believed they were innocent in every possible sense. She had protected their chance to be judged by what they had </w:t>
-      </w:r>
-      <w:proofErr w:type="gramStart"/>
-      <w:r>
-        <w:t>actually done</w:t>
-      </w:r>
-      <w:proofErr w:type="gramEnd"/>
-      <w:r>
-        <w:t>. Trinity had already decided what their cohesion meant before the evidence was complete. It had called their survival a threat because the system had no category for people who chose one another without permission.</w:t>
+        <w:t>Elara had not protected the boys because she believed they were innocent in every possible sense. She had protected their chance to be judged by what they had actually done. Trinity had already decided what their cohesion meant before the evidence was complete. It had called their survival a threat because the system had no category for people who chose one another without permission.</w:t>
       </w:r>
     </w:p>
     <w:p>
@@ -114,19 +82,7 @@
     </w:p>
     <w:p>
       <w:r>
-        <w:t xml:space="preserve">Ashoka did not exist to defend innocence. Innocence was too </w:t>
-      </w:r>
-      <w:proofErr w:type="gramStart"/>
-      <w:r>
-        <w:t>fragile</w:t>
-      </w:r>
-      <w:proofErr w:type="gramEnd"/>
-      <w:r>
-        <w:t xml:space="preserve"> a standard for a city built on scarcity, pressure, and competing claims. Ashoka existed to protect people from force that had exceeded its purpose. It stood between the powerful and those who could not </w:t>
-      </w:r>
-      <w:r>
-        <w:lastRenderedPageBreak/>
-        <w:t>meet power on equal terms. It used strength so that strength would not become the only law left.</w:t>
+        <w:t>Ashoka did not exist to defend innocence. Innocence was too fragile a standard for a city built on scarcity, pressure, and competing claims. Ashoka existed to protect people from force that had exceeded its purpose. It stood between the powerful and those who could not meet power on equal terms. It used strength so that strength would not become the only law left.</w:t>
       </w:r>
     </w:p>
     <w:p>
@@ -161,15 +117,7 @@
     </w:p>
     <w:p>
       <w:r>
-        <w:t xml:space="preserve">Rohan had repeated those principles until they had become physical. They shaped how he entered a room, where he placed his hands, and how long he waited before drawing a weapon. Ashoka did not </w:t>
-      </w:r>
-      <w:proofErr w:type="gramStart"/>
-      <w:r>
-        <w:t>praise force</w:t>
-      </w:r>
-      <w:proofErr w:type="gramEnd"/>
-      <w:r>
-        <w:t xml:space="preserve"> for being force. It praised force that remained accountable to a purpose beyond itself.</w:t>
+        <w:t>Rohan had repeated those principles until they had become physical. They shaped how he entered a room, where he placed his hands, and how long he waited before drawing a weapon. Ashoka did not praise force for being force. It praised force that remained accountable to a purpose beyond itself.</w:t>
       </w:r>
     </w:p>
     <w:p>
@@ -184,15 +132,7 @@
     </w:p>
     <w:p>
       <w:r>
-        <w:t xml:space="preserve">She had seen a system preparing to punish three disadvantaged candidates for </w:t>
-      </w:r>
-      <w:proofErr w:type="gramStart"/>
-      <w:r>
-        <w:t>surviving</w:t>
-      </w:r>
-      <w:proofErr w:type="gramEnd"/>
-      <w:r>
-        <w:t xml:space="preserve"> in a way it could not control. She had preserved their evidence. She had refused to let procedure become an excuse for harm. She had given them the closest thing the Initiation had offered to a fair chance, even though they had never been fighting the system on equal terms.</w:t>
+        <w:t>She had seen a system preparing to punish three disadvantaged candidates for surviving in a way it could not control. She had preserved their evidence. She had refused to let procedure become an excuse for harm. She had given them the closest thing the Initiation had offered to a fair chance, even though they had never been fighting the system on equal terms.</w:t>
       </w:r>
     </w:p>
     <w:p>
@@ -202,23 +142,7 @@
     </w:p>
     <w:p>
       <w:r>
-        <w:t xml:space="preserve">The </w:t>
-      </w:r>
-      <w:proofErr w:type="gramStart"/>
-      <w:r>
-        <w:t>words</w:t>
-      </w:r>
-      <w:proofErr w:type="gramEnd"/>
-      <w:r>
-        <w:t xml:space="preserve"> fair chance troubled him more than the </w:t>
-      </w:r>
-      <w:proofErr w:type="gramStart"/>
-      <w:r>
-        <w:t>word</w:t>
-      </w:r>
-      <w:proofErr w:type="gramEnd"/>
-      <w:r>
-        <w:t xml:space="preserve"> override.</w:t>
+        <w:t>The words fair chance troubled him more than the word override.</w:t>
       </w:r>
     </w:p>
     <w:p>
@@ -228,20 +152,11 @@
     </w:p>
     <w:p>
       <w:r>
-        <w:t xml:space="preserve">The boys had not asked to fight Trinity. They had entered the chamber because the city had placed them there. They had not attacked the monitors, threatened the </w:t>
-      </w:r>
-      <w:proofErr w:type="spellStart"/>
-      <w:r>
-        <w:t>ganas</w:t>
-      </w:r>
-      <w:proofErr w:type="spellEnd"/>
-      <w:r>
-        <w:t>, or tried to escape the structure that governed them. They had split food, carried one another, and remained together when the system demanded separation.</w:t>
-      </w:r>
-    </w:p>
-    <w:p>
-      <w:r>
-        <w:lastRenderedPageBreak/>
+        <w:t>The boys had not asked to fight Trinity. They had entered the chamber because the city had placed them there. They had not attacked the monitors, threatened the ganas, or tried to escape the structure that governed them. They had split food, carried one another, and remained together when the system demanded separation.</w:t>
+      </w:r>
+    </w:p>
+    <w:p>
+      <w:r>
         <w:t>How could preserving that be wrong?</w:t>
       </w:r>
     </w:p>
@@ -252,31 +167,7 @@
     </w:p>
     <w:p>
       <w:r>
-        <w:t xml:space="preserve">The question changed shape each time he asked it. When he viewed the incident as Ashoka's representative, the footage suggested that another </w:t>
-      </w:r>
-      <w:proofErr w:type="spellStart"/>
-      <w:r>
-        <w:t>gana's</w:t>
-      </w:r>
-      <w:proofErr w:type="spellEnd"/>
-      <w:r>
-        <w:t xml:space="preserve"> officer had altered the record inside a shared operation. Rohan did not yet know whether Elara had acted alone, whether the system had concealed the change, or whether anyone else had authorized it. If Rohan intervened every </w:t>
-      </w:r>
-      <w:proofErr w:type="gramStart"/>
-      <w:r>
-        <w:t>time</w:t>
-      </w:r>
-      <w:proofErr w:type="gramEnd"/>
-      <w:r>
-        <w:t xml:space="preserve"> he believed another institution had made a poor decision, Ashoka would become an unelected court over the other </w:t>
-      </w:r>
-      <w:proofErr w:type="spellStart"/>
-      <w:r>
-        <w:t>ganas</w:t>
-      </w:r>
-      <w:proofErr w:type="spellEnd"/>
-      <w:r>
-        <w:t>. Protection would become jurisdiction. Judgment would become ownership.</w:t>
+        <w:t>The question changed shape each time he asked it. When he viewed the incident as Ashoka's representative, the footage suggested that another gana's officer had altered the record inside a shared operation. Rohan did not yet know whether Elara had acted alone, whether the system had concealed the change, or whether anyone else had authorized it. If Rohan intervened every time he believed another institution had made a poor decision, Ashoka would become an unelected court over the other ganas. Protection would become jurisdiction. Judgment would become ownership.</w:t>
       </w:r>
     </w:p>
     <w:p>
@@ -286,36 +177,12 @@
     </w:p>
     <w:p>
       <w:r>
-        <w:t xml:space="preserve">The city did not belong only to the </w:t>
-      </w:r>
-      <w:proofErr w:type="spellStart"/>
-      <w:r>
-        <w:t>ganas</w:t>
-      </w:r>
-      <w:proofErr w:type="spellEnd"/>
-      <w:r>
-        <w:t xml:space="preserve">. It belonged to the miners below the cloud line, the children in the intake chambers, the technicians who kept the platforms alive, and the families whose names appeared in records only when something had gone wrong. If the four institutions claimed authority over the whole city, then duty could not end at the edge of one </w:t>
-      </w:r>
-      <w:proofErr w:type="spellStart"/>
-      <w:r>
-        <w:t>gana's</w:t>
-      </w:r>
-      <w:proofErr w:type="spellEnd"/>
-      <w:r>
-        <w:t xml:space="preserve"> jurisdiction.</w:t>
-      </w:r>
-    </w:p>
-    <w:p>
-      <w:r>
-        <w:t xml:space="preserve">A citizen could not watch a vulnerable person </w:t>
-      </w:r>
-      <w:proofErr w:type="gramStart"/>
-      <w:r>
-        <w:t>be crushed</w:t>
-      </w:r>
-      <w:proofErr w:type="gramEnd"/>
-      <w:r>
-        <w:t xml:space="preserve"> by an unfair process and call silence respect for boundaries.</w:t>
+        <w:t>The city did not belong only to the ganas. It belonged to the miners below the cloud line, the children in the intake chambers, the technicians who kept the platforms alive, and the families whose names appeared in records only when something had gone wrong. If the four institutions claimed authority over the whole city, then duty could not end at the edge of one gana's jurisdiction.</w:t>
+      </w:r>
+    </w:p>
+    <w:p>
+      <w:r>
+        <w:t>A citizen could not watch a vulnerable person be crushed by an unfair process and call silence respect for boundaries.</w:t>
       </w:r>
     </w:p>
     <w:p>
@@ -325,10 +192,7 @@
     </w:p>
     <w:p>
       <w:r>
-        <w:t>For two days, Rohan carried the contradiction through drills, briefings, meals, and sleep. He trained recruits to stop a strike after the threat ended, then wondered whether Ashoka itself knew when to stop. He signed a deployment review that protected a supply corridor while Drona's request for an Ashoka review of the Initiation records waited in another queue. He read casualty reports from old interventions and saw how often the language of necessary force remained in place long after necessity had disappe</w:t>
-      </w:r>
-      <w:r>
-        <w:t>ared.</w:t>
+        <w:t>For two days, Rohan carried the contradiction through drills, briefings, meals, and sleep. He trained recruits to stop a strike after the threat ended, then wondered whether Ashoka itself knew when to stop. He signed a deployment review that protected a supply corridor while Drona's request for an Ashoka review of the Initiation records waited in another queue. He read casualty reports from old interventions and saw how often the language of necessary force remained in place long after necessity had disappeared.</w:t>
       </w:r>
     </w:p>
     <w:p>
@@ -343,28 +207,12 @@
     </w:p>
     <w:p>
       <w:r>
-        <w:t xml:space="preserve">That distinction had once mattered to the elders. In the early years of Trinity, Ashoka had stood between the city's people and the dangers created by all four </w:t>
-      </w:r>
-      <w:proofErr w:type="spellStart"/>
-      <w:r>
-        <w:t>ganas</w:t>
-      </w:r>
-      <w:proofErr w:type="spellEnd"/>
-      <w:r>
-        <w:t>. Its responders had escorted the weak through riots, opened evacuation routes without asking which institution a family served, and restrained their own officers when anger threatened to become policy.</w:t>
-      </w:r>
-    </w:p>
-    <w:p>
-      <w:r>
-        <w:t xml:space="preserve">Over time, the image had changed. Ashoka became the red wall. The armed corridor. The uniform at the door. The </w:t>
-      </w:r>
-      <w:proofErr w:type="spellStart"/>
-      <w:r>
-        <w:t>gana</w:t>
-      </w:r>
-      <w:proofErr w:type="spellEnd"/>
-      <w:r>
-        <w:t xml:space="preserve"> called when something had to be stopped and rarely asked what should be protected after the stopping was done.</w:t>
+        <w:t>That distinction had once mattered to the elders. In the early years of Trinity, Ashoka had stood between the city's people and the dangers created by all four ganas. Its responders had escorted the weak through riots, opened evacuation routes without asking which institution a family served, and restrained their own officers when anger threatened to become policy.</w:t>
+      </w:r>
+    </w:p>
+    <w:p>
+      <w:r>
+        <w:t>Over time, the image had changed. Ashoka became the red wall. The armed corridor. The uniform at the door. The gana called when something had to be stopped and rarely asked what should be protected after the stopping was done.</w:t>
       </w:r>
     </w:p>
     <w:p>
@@ -374,7 +222,6 @@
     </w:p>
     <w:p>
       <w:r>
-        <w:lastRenderedPageBreak/>
         <w:t>Elara's decision forced him to confront what Ashoka had allowed itself to forget: it was meant to be the city's guardian, not merely its instrument of force.</w:t>
       </w:r>
     </w:p>
@@ -425,84 +272,27 @@
     </w:p>
     <w:p>
       <w:r>
-        <w:t xml:space="preserve">On the second evening, after completing the day's duties, Rohan taught the Little Dragon's dojo class. He was a second-dan </w:t>
-      </w:r>
-      <w:proofErr w:type="spellStart"/>
-      <w:r>
-        <w:t>Wadō-ryū</w:t>
-      </w:r>
-      <w:proofErr w:type="spellEnd"/>
-      <w:r>
-        <w:t xml:space="preserve"> black belt and the chief instructor, though the children rarely used either title when he was close enough to touch. To them, he was simply Rohan: the enormous man who could correct a stance with two fingers, lift a crying child onto his shoulder, and make the hardest exercise feel like a secret they were learning together.</w:t>
-      </w:r>
-    </w:p>
-    <w:p>
-      <w:r>
-        <w:t xml:space="preserve">The children were too young to know what the other </w:t>
-      </w:r>
-      <w:proofErr w:type="spellStart"/>
-      <w:r>
-        <w:t>ganas</w:t>
-      </w:r>
-      <w:proofErr w:type="spellEnd"/>
-      <w:r>
-        <w:t xml:space="preserve"> believed about Ashoka. They did not know that Drona considered Ashoka blunt, that Chanakya considered it unsophisticated, or that Kubera preferred to see only the uniform and the force behind it. They knew the dojo floor, the red boundary marks, the discipline of a bowed head, and the difference between a strike that stopped a threat and a strike thrown to display power. When Rohan entered, they straightened at once. When he smiled, they forgot to remain solemn.</w:t>
-      </w:r>
-    </w:p>
-    <w:p>
-      <w:r>
-        <w:t xml:space="preserve">Rohan taught them an old Ashoka form called </w:t>
-      </w:r>
-      <w:proofErr w:type="spellStart"/>
-      <w:r>
-        <w:t>Wadō-ryū</w:t>
-      </w:r>
-      <w:proofErr w:type="spellEnd"/>
-      <w:r>
-        <w:t xml:space="preserve">, the Way of Peace and Harmony. The name confused visitors. Ashoka was supposed to be the </w:t>
-      </w:r>
-      <w:proofErr w:type="spellStart"/>
-      <w:r>
-        <w:t>gana</w:t>
-      </w:r>
-      <w:proofErr w:type="spellEnd"/>
-      <w:r>
-        <w:t xml:space="preserve"> of force. Its answer was that force without harmony was only fear wearing a uniform.</w:t>
-      </w:r>
-    </w:p>
-    <w:p>
-      <w:r>
-        <w:lastRenderedPageBreak/>
+        <w:t>On the second evening, after completing the day's duties, Rohan taught the Little Dragon's dojo class. He was a second-dan Wadō-ryū black belt and the chief instructor, though the children rarely used either title when he was close enough to touch. To them, he was simply Rohan: the enormous man who could correct a stance with two fingers, lift a crying child onto his shoulder, and make the hardest exercise feel like a secret they were learning together.</w:t>
+      </w:r>
+    </w:p>
+    <w:p>
+      <w:r>
+        <w:t>The children were too young to know what the other ganas believed about Ashoka. They did not know that Drona considered Ashoka blunt, that Chanakya considered it unsophisticated, or that Kubera preferred to see only the uniform and the force behind it. They knew the dojo floor, the red boundary marks, the discipline of a bowed head, and the difference between a strike that stopped a threat and a strike thrown to display power. When Rohan entered, they straightened at once. When he smiled, they forgot to remain solemn.</w:t>
+      </w:r>
+    </w:p>
+    <w:p>
+      <w:r>
+        <w:t>Rohan taught them an old Ashoka form called Wadō-ryū, the Way of Peace and Harmony. The name confused visitors. Ashoka was supposed to be the gana of force. Its answer was that force without harmony was only fear wearing a uniform.</w:t>
+      </w:r>
+    </w:p>
+    <w:p>
+      <w:r>
         <w:t>Other disciplines had their own truths. Muay Thai trained the body to use eight points of contact: fists, elbows, knees, and shins. Judo turned balance against itself through throws, grips, and controlled falls. Taekwondo made distance into a weapon through speed, timing, and precise kicks. Aikido emphasized redirection, using an attacker's momentum rather than meeting force with force. Brazilian jiu-jitsu taught leverage from the ground, allowing a smaller person to survive against a stronger one.</w:t>
       </w:r>
     </w:p>
     <w:p>
       <w:r>
-        <w:t xml:space="preserve">Ashoka respected all of them. It had chosen </w:t>
-      </w:r>
-      <w:proofErr w:type="spellStart"/>
-      <w:r>
-        <w:t>Wadō-ryū</w:t>
-      </w:r>
-      <w:proofErr w:type="spellEnd"/>
-      <w:r>
-        <w:t xml:space="preserve"> because its principles suited the duty the </w:t>
-      </w:r>
-      <w:proofErr w:type="spellStart"/>
-      <w:r>
-        <w:t>gana</w:t>
-      </w:r>
-      <w:proofErr w:type="spellEnd"/>
-      <w:r>
-        <w:t xml:space="preserve"> wanted to </w:t>
-      </w:r>
-      <w:proofErr w:type="gramStart"/>
-      <w:r>
-        <w:t>embody:</w:t>
-      </w:r>
-      <w:proofErr w:type="gramEnd"/>
-      <w:r>
-        <w:t xml:space="preserve"> evade before meeting force, preserve balance under pressure, protect the person in front of you, and make defense strong enough that violence became unnecessary whenever another choice remained. The best offense was not the first strike. It was the position that made the first strike unnecessary.</w:t>
+        <w:t>Ashoka respected all of them. It had chosen Wadō-ryū because its principles suited the duty the gana wanted to embody: evade before meeting force, preserve balance under pressure, protect the person in front of you, and make defense strong enough that violence became unnecessary whenever another choice remained. The best offense was not the first strike. It was the position that made the first strike unnecessary.</w:t>
       </w:r>
     </w:p>
     <w:p>
@@ -512,18 +302,7 @@
     </w:p>
     <w:p>
       <w:r>
-        <w:t xml:space="preserve">Tavi watched the door so closely that he forgot his own stance; Rohan taught him that a guardian who fell every time someone else stumbled could not hold a line. Meera moved so quickly that she outran every correction; Rohan made her repeat the movement until she could stop her hand before contact, teaching her that power became discipline only when it could stop itself. Niko fell during every exercise but always stood, bowed, and tried again. Arjun obeyed every instruction until another child needed help, </w:t>
-      </w:r>
-      <w:r>
-        <w:t xml:space="preserve">then broke formation to steady them. Rohan taught them all the same </w:t>
-      </w:r>
-      <w:proofErr w:type="gramStart"/>
-      <w:r>
-        <w:t>lesson</w:t>
-      </w:r>
-      <w:proofErr w:type="gramEnd"/>
-      <w:r>
-        <w:t>: protection required balance, courage included recovery, and obedience without awareness was not guardianship.</w:t>
+        <w:t>Tavi watched the door so closely that he forgot his own stance; Rohan taught him that a guardian who fell every time someone else stumbled could not hold a line. Meera moved so quickly that she outran every correction; Rohan made her repeat the movement until she could stop her hand before contact, teaching her that power became discipline only when it could stop itself. Niko fell during every exercise but always stood, bowed, and tried again. Arjun obeyed every instruction until another child needed help, then broke formation to steady them. Rohan taught them all the same lesson: protection required balance, courage included recovery, and obedience without awareness was not guardianship.</w:t>
       </w:r>
     </w:p>
     <w:p>
@@ -548,29 +327,12 @@
     </w:p>
     <w:p>
       <w:r>
-        <w:t xml:space="preserve">Claudia stumbled backward, caught herself, and looked toward Rohan. He gave no </w:t>
-      </w:r>
-      <w:proofErr w:type="gramStart"/>
-      <w:r>
-        <w:t>instruction</w:t>
-      </w:r>
-      <w:proofErr w:type="gramEnd"/>
-      <w:r>
-        <w:t>. This was her examination; she had to find the next correct movement herself.</w:t>
-      </w:r>
-    </w:p>
-    <w:p>
-      <w:r>
-        <w:lastRenderedPageBreak/>
-        <w:t xml:space="preserve">Dev came forward a third </w:t>
-      </w:r>
-      <w:proofErr w:type="gramStart"/>
-      <w:r>
-        <w:t>time,</w:t>
-      </w:r>
-      <w:proofErr w:type="gramEnd"/>
-      <w:r>
-        <w:t xml:space="preserve"> certain he knew how Claudia would respond. Claudia moved aside instead of back. His glove passed her shoulder. She placed her palm against his ribs, light enough to show control and firm enough to count.</w:t>
+        <w:t>Claudia stumbled backward, caught herself, and looked toward Rohan. He gave no instruction. This was her examination; she had to find the next correct movement herself.</w:t>
+      </w:r>
+    </w:p>
+    <w:p>
+      <w:r>
+        <w:t>Dev came forward a third time, certain he knew how Claudia would respond. Claudia moved aside instead of back. His glove passed her shoulder. She placed her palm against his ribs, light enough to show control and firm enough to count.</w:t>
       </w:r>
     </w:p>
     <w:p>
@@ -590,15 +352,7 @@
     </w:p>
     <w:p>
       <w:r>
-        <w:t xml:space="preserve">Rohan saw the decision arrive in her face. She could stay down and let the round end. She could </w:t>
-      </w:r>
-      <w:proofErr w:type="gramStart"/>
-      <w:r>
-        <w:t>rush up</w:t>
-      </w:r>
-      <w:proofErr w:type="gramEnd"/>
-      <w:r>
-        <w:t xml:space="preserve"> angry and turn the next exchange into a collision. Or she could breathe, recover her stance, and begin again.</w:t>
+        <w:t>Rohan saw the decision arrive in her face. She could stay down and let the round end. She could rush up angry and turn the next exchange into a collision. Or she could breathe, recover her stance, and begin again.</w:t>
       </w:r>
     </w:p>
     <w:p>
@@ -663,16 +417,7 @@
     </w:p>
     <w:p>
       <w:r>
-        <w:lastRenderedPageBreak/>
-        <w:t xml:space="preserve">"You have completed the requirements," he said. "Not because you defeated Dev. You did not. You completed them because you kept your mind clear, your body under control, and your spirit willing to return to </w:t>
-      </w:r>
-      <w:proofErr w:type="gramStart"/>
-      <w:r>
-        <w:t>the work</w:t>
-      </w:r>
-      <w:proofErr w:type="gramEnd"/>
-      <w:r>
-        <w:t>."</w:t>
+        <w:t>"You have completed the requirements," he said. "Not because you defeated Dev. You did not. You completed them because you kept your mind clear, your body under control, and your spirit willing to return to the work."</w:t>
       </w:r>
     </w:p>
     <w:p>
@@ -697,23 +442,7 @@
     </w:p>
     <w:p>
       <w:r>
-        <w:t xml:space="preserve">The lesson had always been misunderstood outside Ashoka. The </w:t>
-      </w:r>
-      <w:proofErr w:type="spellStart"/>
-      <w:r>
-        <w:t>gana</w:t>
-      </w:r>
-      <w:proofErr w:type="spellEnd"/>
-      <w:r>
-        <w:t xml:space="preserve"> did not train aggressors. It trained defenders who could display violence only when violence was necessary, and restraint when it was not. Ashoka allowed other institutions to mistake discipline for simplicity. There was advantage in being underestimated. Beneath the hard rooms, the red uniforms, and the silence of its responders, the </w:t>
-      </w:r>
-      <w:proofErr w:type="spellStart"/>
-      <w:r>
-        <w:t>gana</w:t>
-      </w:r>
-      <w:proofErr w:type="spellEnd"/>
-      <w:r>
-        <w:t xml:space="preserve"> preserved an intellectual tradition of judgment, proportion, and responsibility that few outsiders had bothered to study.</w:t>
+        <w:t>The lesson had always been misunderstood outside Ashoka. The gana did not train aggressors. It trained defenders who could display violence only when violence was necessary, and restraint when it was not. Ashoka allowed other institutions to mistake discipline for simplicity. There was advantage in being underestimated. Beneath the hard rooms, the red uniforms, and the silence of its responders, the gana preserved an intellectual tradition of judgment, proportion, and responsibility that few outsiders had bothered to study.</w:t>
       </w:r>
     </w:p>
     <w:p>
@@ -748,29 +477,12 @@
     </w:p>
     <w:p>
       <w:r>
-        <w:lastRenderedPageBreak/>
         <w:t>The comparison did not make her action authorized. It made it harder to call the action wrong.</w:t>
       </w:r>
     </w:p>
     <w:p>
       <w:r>
-        <w:t xml:space="preserve">That evening, Rohan decided to ask the Grandmaster for her counsel. He needed guidance that did not come from a report, a protocol, or a </w:t>
-      </w:r>
-      <w:proofErr w:type="gramStart"/>
-      <w:r>
-        <w:t>frightened</w:t>
-      </w:r>
-      <w:proofErr w:type="gramEnd"/>
-      <w:r>
-        <w:t xml:space="preserve"> interpretation of what the other </w:t>
-      </w:r>
-      <w:proofErr w:type="spellStart"/>
-      <w:r>
-        <w:t>ganas</w:t>
-      </w:r>
-      <w:proofErr w:type="spellEnd"/>
-      <w:r>
-        <w:t xml:space="preserve"> might do. He needed to know whether Ashoka could uphold a just act of courage by a Drona monitor without turning justice into interference or protection into another claim of power.</w:t>
+        <w:t>That evening, Rohan decided to ask the Grandmaster for her counsel. He needed guidance that did not come from a report, a protocol, or a frightened interpretation of what the other ganas might do. He needed to know whether Ashoka could uphold a just act of courage by a Drona monitor without turning justice into interference or protection into another claim of power.</w:t>
       </w:r>
     </w:p>
     <w:p>
@@ -820,48 +532,17 @@
     </w:p>
     <w:p>
       <w:r>
-        <w:rPr>
-          <w:highlight w:val="yellow"/>
-        </w:rPr>
         <w:t>At exactly 4:00 a.m., his room panel brightened.</w:t>
       </w:r>
     </w:p>
     <w:p>
       <w:r>
-        <w:t xml:space="preserve">Rohan woke before the second tone. He rose, washed, and dressed </w:t>
-      </w:r>
-      <w:proofErr w:type="gramStart"/>
-      <w:r>
-        <w:t>with</w:t>
-      </w:r>
-      <w:proofErr w:type="gramEnd"/>
-      <w:r>
-        <w:t xml:space="preserve"> the care the occasion required. He wore the traditional Ashoka </w:t>
-      </w:r>
-      <w:proofErr w:type="spellStart"/>
-      <w:r>
-        <w:t>Wadō-ryū</w:t>
-      </w:r>
-      <w:proofErr w:type="spellEnd"/>
-      <w:r>
-        <w:t xml:space="preserve"> kimono: deep red cloth, black trim, a white belt, and the </w:t>
-      </w:r>
-      <w:proofErr w:type="gramStart"/>
-      <w:r>
-        <w:t>small embroidered</w:t>
-      </w:r>
-      <w:proofErr w:type="gramEnd"/>
-      <w:r>
-        <w:t xml:space="preserve"> insignia positioned over his heart. He checked the fold of the collar, the knot at his waist, and the fall of the sleeves. Today he would stand among people who moved armies, directed divisions, and decided which dangers the public </w:t>
-      </w:r>
-      <w:r>
-        <w:lastRenderedPageBreak/>
-        <w:t>was permitted to know. He would not arrive looking as though he had been surprised into importance.</w:t>
-      </w:r>
-    </w:p>
-    <w:p>
-      <w:r>
-        <w:t>By dawn, the ceremony filled Ashoka's central hall. Red standards hung from the upper galleries. Generals stood in formal rows beneath the insignias of their divisions. Ministers, state leaders, and strategic advisers occupied the front tiers, their presence turning a martial promotion into a public statement about who was trusted to hold power.</w:t>
+        <w:t>Rohan woke at once. He rose, washed, and dressed with the care the occasion required. He wore the traditional Ashoka Wadō-ryū kimono: white cloth, black trim, and a black belt embroidered with 二段 [second dan] beside his name in Japanese, ローハン [Rohan]. He checked the fold of the collar, the knot at his waist, and the fall of the sleeves. Today he would stand among people who moved armies, directed divisions, and decided which dangers the public was permitted to know. He would not arrive looking as though he had been surprised into importance.</w:t>
+      </w:r>
+    </w:p>
+    <w:p>
+      <w:r>
+        <w:t>By dawn, the ceremony filled Ashoka's central hall. Red standards hung from the upper galleries. Generals stood in formal rows beneath the insignias of their divisions. Ministers, state leaders, and strategic advisers occupied the front tiers. Their presence made the ceremony more than a martial-arts promotion. It became a public declaration that the state trusted the Grandmaster to hold and direct power.</w:t>
       </w:r>
     </w:p>
     <w:p>
@@ -871,28 +552,12 @@
     </w:p>
     <w:p>
       <w:r>
-        <w:t xml:space="preserve">The ascension was not presented as a reward for victory. The eighth dan represented the ability to carry force without being carried away by it: mastery of body, mind, spirit, and consequence. The final demonstration was brief. The Grandmaster redirected an advancing instructor, broke the line of attack, and stopped with her hand resting against the opponent's shoulder. She could have </w:t>
-      </w:r>
-      <w:proofErr w:type="gramStart"/>
-      <w:r>
-        <w:t>struck</w:t>
-      </w:r>
-      <w:proofErr w:type="gramEnd"/>
-      <w:r>
-        <w:t>. The ceremony required everyone to understand that she had chosen not to.</w:t>
-      </w:r>
-    </w:p>
-    <w:p>
-      <w:r>
-        <w:t xml:space="preserve">Rohan watched the assembled leaders applaud. He thought of Elara at her console, making the same kind of decision in a room that had offered her no ceremony and no witness willing to defend her. The Grandmaster's achievement was mastery recognized by the state. Elara's had been </w:t>
-      </w:r>
-      <w:proofErr w:type="gramStart"/>
-      <w:r>
-        <w:t>judgment exercised</w:t>
-      </w:r>
-      <w:proofErr w:type="gramEnd"/>
-      <w:r>
-        <w:t xml:space="preserve"> without permission.</w:t>
+        <w:t>The ascension was not presented as a reward for victory. The eighth dan represented the ability to carry force without being carried away by it: mastery of body, mind, spirit, and consequence. The final demonstration was brief. The Grandmaster redirected an advancing instructor, broke the line of attack, and stopped with her hand resting against the opponent's shoulder. She could have struck. The ceremony required everyone to understand that she had chosen not to.</w:t>
+      </w:r>
+    </w:p>
+    <w:p>
+      <w:r>
+        <w:t>Rohan watched the assembled leaders applaud. He thought of Elara at her console, making the same kind of decision in a room that had offered her no ceremony and no witness willing to defend her. The Grandmaster's achievement was mastery recognized by the state. Elara's had been judgment exercised without permission.</w:t>
       </w:r>
     </w:p>
     <w:p>
@@ -902,15 +567,7 @@
     </w:p>
     <w:p>
       <w:r>
-        <w:t xml:space="preserve">The Grandmaster remained at the center of the dojo while the state leaders and generals took their seats around the perimeter. The eighth-dan candidacy was not decided by applause. It required a final examination before the oldest authority </w:t>
-      </w:r>
-      <w:proofErr w:type="spellStart"/>
-      <w:r>
-        <w:t>Wadō-ryū</w:t>
-      </w:r>
-      <w:proofErr w:type="spellEnd"/>
-      <w:r>
-        <w:t xml:space="preserve"> still recognized.</w:t>
+        <w:t>The Grandmaster remained at the center of the dojo while the state leaders and generals took their seats around the perimeter. The eighth-dan candidacy was not decided by applause. It required a final examination before the oldest authority Wadō-ryū still recognized.</w:t>
       </w:r>
     </w:p>
     <w:p>
@@ -935,29 +592,12 @@
     </w:p>
     <w:p>
       <w:r>
-        <w:t xml:space="preserve">The impression of age vanished. He crossed the distance without appearing to hurry, his feet sliding over the boards with such </w:t>
-      </w:r>
-      <w:proofErr w:type="gramStart"/>
-      <w:r>
-        <w:t>economy</w:t>
-      </w:r>
-      <w:proofErr w:type="gramEnd"/>
-      <w:r>
-        <w:t xml:space="preserve"> that the body seemed to arrive before the motion had begun. He was small beside the Grandmaster, but the entire hall adjusted around him. Generals stopped whispering. Strategists lowered their tablets. Even the state leaders watched with the careful attention of people who understood that the old man could cross a room before any guard had time to decide whether he was dangerous.</w:t>
-      </w:r>
-    </w:p>
-    <w:p>
-      <w:r>
-        <w:lastRenderedPageBreak/>
-        <w:t xml:space="preserve">Master Vayun was the presiding tenth-dan practitioner of </w:t>
-      </w:r>
-      <w:proofErr w:type="spellStart"/>
-      <w:r>
-        <w:t>Wadō-ryū</w:t>
-      </w:r>
-      <w:proofErr w:type="spellEnd"/>
-      <w:r>
-        <w:t>, the last living master permitted to judge whether a candidate understood the art beyond its movements. He had trained responders before Ashoka's modern divisions existed. Some said he had never lost a full-contact bout. Others said that was the wrong measure, because he had ended every serious encounter before it became a bout at all.</w:t>
+        <w:t>The impression of age vanished. He crossed the distance without appearing to hurry, his feet sliding over the boards with such economy that the body seemed to arrive before the motion had begun. He was small beside the Grandmaster, but the entire hall adjusted around him. Generals stopped whispering. Strategists lowered their tablets. Even the state leaders watched with the careful attention of people who understood that the old man could cross a room before any guard had time to decide whether he was dangerous.</w:t>
+      </w:r>
+    </w:p>
+    <w:p>
+      <w:r>
+        <w:t>Master Vayun was the presiding tenth-dan practitioner of Wadō-ryū, the last living master permitted to judge whether a candidate understood the art beyond its movements. He had trained responders before Ashoka's modern divisions existed. Some said he had never lost a full-contact bout. Others said that was the wrong measure, because he had ended every serious encounter before it became a bout at all.</w:t>
       </w:r>
     </w:p>
     <w:p>
@@ -972,31 +612,12 @@
     </w:p>
     <w:p>
       <w:r>
-        <w:t>Rohan moved to the back row, where junior instructors and senior students had been placed. His second-dan black belt made him senior enough to be recognized, but not important enough to expect a place near the examination floor. He sat with his hands resting on his knees, careful not to draw attention. The hall was too grand for him to feel like a participant. It was filled with national ministers, defense generals, division commanders, and strategic leaders whose decisions could close a city gate or redire</w:t>
-      </w:r>
-      <w:r>
-        <w:t>ct an entire response force.</w:t>
-      </w:r>
-    </w:p>
-    <w:p>
-      <w:r>
-        <w:t xml:space="preserve">A volunteer student approached him during the silence before the examination. She was dressed in </w:t>
-      </w:r>
-      <w:proofErr w:type="gramStart"/>
-      <w:r>
-        <w:t>white,</w:t>
-      </w:r>
-      <w:proofErr w:type="gramEnd"/>
-      <w:r>
-        <w:t xml:space="preserve"> her brown belt tied neatly </w:t>
-      </w:r>
-      <w:proofErr w:type="gramStart"/>
-      <w:r>
-        <w:t>at</w:t>
-      </w:r>
-      <w:proofErr w:type="gramEnd"/>
-      <w:r>
-        <w:t xml:space="preserve"> her waist.</w:t>
+        <w:t>Rohan moved to the back row, where junior instructors and senior students had been placed. His second-dan black belt made him senior enough to be recognized, but not important enough to expect a place near the examination floor. He sat with his hands resting on his knees, careful not to draw attention. The hall was too grand for him to feel like a participant. It was filled with national ministers, defense generals, division commanders, and strategic leaders whose decisions could close a city gate or redirect an entire response force.</w:t>
+      </w:r>
+    </w:p>
+    <w:p>
+      <w:r>
+        <w:t>A volunteer student approached him during the silence before the examination. She was dressed in white, her brown belt tied neatly at her waist.</w:t>
       </w:r>
     </w:p>
     <w:p>
@@ -1016,7 +637,7 @@
     </w:p>
     <w:p>
       <w:r>
-        <w:t>Rohan glanced toward the floor. Master Vayun stood beside the Grandmaster, apparently looking at nothing. The request made no sense. Rohan was not a tenth-dan practitioner, a state leader, or a member of the examination council. He had come to observe.</w:t>
+        <w:t>Rohan glanced toward the floor. Master Vayun stood beside the Grandmaster, apparently looking at nothing. The request made no sense. Rohan was a second-dan instructor, not a member of the examination council or one of the senior masters whose judgment carried authority in the ceremony. He had come to observe.</w:t>
       </w:r>
     </w:p>
     <w:p>
@@ -1046,7 +667,6 @@
     </w:p>
     <w:p>
       <w:r>
-        <w:lastRenderedPageBreak/>
         <w:t>Master Vayun returned the bow with a slight inclination of his head.</w:t>
       </w:r>
     </w:p>
@@ -1087,7 +707,7 @@
     </w:p>
     <w:p>
       <w:r>
-        <w:t>Rohan felt goosebumps rise along his arms beneath the red-and-black kimono.</w:t>
+        <w:t>Rohan felt goosebumps rise along his arms beneath the white kimono.</w:t>
       </w:r>
     </w:p>
     <w:p>
@@ -1107,12 +727,7 @@
     </w:p>
     <w:p>
       <w:r>
-        <w:t>Rohan understood then that the ceremony had not been an invitation to observe.</w:t>
-      </w:r>
-    </w:p>
-    <w:p>
-      <w:r>
-        <w:t>It had been an invitation to wait for what happened next.</w:t>
+        <w:t>Rohan understood then that the invitation had never been about observation. He had been brought forward because the ceremony had something waiting for him.</w:t>
       </w:r>
     </w:p>
     <w:sectPr>

</xml_diff>

<commit_message>
Ch15: ground Wado-ryu as Old-Era salvage, cut modern martial-arts catalog, compress pupil vignettes, convert weak negations; tracker: add Japanese text to language checks
</commit_message>
<xml_diff>
--- a/manuscript/chapter-15-the-guardians.docx
+++ b/manuscript/chapter-15-the-guardians.docx
@@ -66,7 +66,7 @@
     </w:p>
     <w:p>
       <w:r>
-        <w:t>On the first review, her decision looked like personal judgment. She had seen three boys she could not bear to surrender to a procedure and had acted according to the truth she felt in the moment. That was not the same as authorization. It was not the same as law. It was not the same as proof.</w:t>
+        <w:t>On the first review, her decision looked like personal judgment. She had seen three boys she could not bear to surrender to a procedure and had acted according to the truth she felt in the moment. That was not the same as authorization, or law, or proof.</w:t>
       </w:r>
     </w:p>
     <w:p>
@@ -296,27 +296,17 @@
     </w:p>
     <w:p>
       <w:r>
-        <w:t>Rohan taught them an old Ashoka form called Wadō-ryū, the Way of Peace and Harmony. The name confused visitors. Ashoka was supposed to be the gana of force. Its answer was that force without harmony was only fear wearing a uniform.</w:t>
-      </w:r>
-    </w:p>
-    <w:p>
-      <w:r>
-        <w:t>Other disciplines had their own truths. Muay Thai trained the body to use eight points of contact: fists, elbows, knees, and shins. Judo turned balance against itself through throws, grips, and controlled falls. Taekwondo made distance into a weapon through speed, timing, and precise kicks. Aikido emphasized redirection, using an attacker's momentum rather than meeting force with force. Brazilian jiu-jitsu taught leverage from the ground, allowing a smaller person to survive against a stronger one.</w:t>
-      </w:r>
-    </w:p>
-    <w:p>
-      <w:r>
-        <w:t>Ashoka respected all of them. It had chosen Wadō-ryū because its principles suited the duty the gana wanted to embody: evade before meeting force, preserve balance under pressure, protect the person in front of you, and make defense strong enough that violence became unnecessary whenever another choice remained. The best offense was not the first strike. It was the position that made the first strike unnecessary.</w:t>
-      </w:r>
-    </w:p>
-    <w:p>
-      <w:r>
-        <w:t>The Little Dragons practiced in pairs, each child carrying a different piece of Ashoka without knowing the names of the principles yet.</w:t>
-      </w:r>
-    </w:p>
-    <w:p>
-      <w:r>
-        <w:t>Tavi watched the door so closely that he forgot his own stance; Rohan taught him that a guardian who fell every time someone else stumbled could not hold a line. Meera moved so quickly that she outran every correction; Rohan made her repeat the movement until she could stop her hand before contact, teaching her that power became discipline only when it could stop itself. Niko fell during every exercise but always stood, bowed, and tried again. Arjun obeyed every instruction until another child needed help, then broke formation to steady them. Rohan taught them all the same lesson: protection required balance, courage included recovery, and obedience without awareness was not guardianship.</w:t>
+        <w:t>Rohan taught them Wadō-ryū, the Way of Peace and Harmony — one of the old fighting arts Ashoka had carried out of the Old Era when the rest of the world's knowledge was being sealed away. Other arts survived only as fragments in Ashoka's archives, attached to the names of masters no living person had met. The gana had chosen Wadō-ryū to keep alive because its principles suited the duty it wanted to embody: evade before meeting force, preserve balance under pressure, protect the person in front of you, and make defense strong enough that violence became unnecessary whenever another choice remained. The best offense was not the first strike. It was the position that made the first strike unnecessary.</w:t>
+      </w:r>
+    </w:p>
+    <w:p>
+      <w:r>
+        <w:t>The name confused visitors. Ashoka was supposed to be the gana of force. Its answer was that force without harmony was only fear wearing a uniform.</w:t>
+      </w:r>
+    </w:p>
+    <w:p>
+      <w:r>
+        <w:t>The Little Dragons practiced in pairs, each child carrying a different piece of Ashoka without knowing the names of the principles yet: Tavi, who watched the door so closely he forgot his own stance; Meera, who outran every correction until Rohan taught her that power became discipline only when it could stop itself; Niko, who fell during every exercise and always stood, bowed, and tried again. Rohan taught them all the same lesson: protection required balance, courage included recovery, and obedience without awareness was not guardianship.</w:t>
       </w:r>
     </w:p>
     <w:p>
@@ -451,12 +441,12 @@
     </w:p>
     <w:p>
       <w:r>
-        <w:t>That was the lesson Ashoka tried to preserve beneath every uniform and every weapon. The body could be powerful without becoming cruel. The mind had to remain clear when fear narrowed it. Spirit was not a distant mystery. It was the decision to keep strength answerable to a purpose.</w:t>
-      </w:r>
-    </w:p>
-    <w:p>
-      <w:r>
-        <w:t>The lesson had always been misunderstood outside Ashoka. The gana did not train aggressors. It trained defenders who could display violence only when violence was necessary, and restraint when it was not. Ashoka allowed other institutions to mistake discipline for simplicity. There was advantage in being underestimated. Beneath the hard rooms, the red uniforms, and the silence of its responders, the gana preserved an intellectual tradition of judgment, proportion, and responsibility that few outsiders had bothered to study.</w:t>
+        <w:t>That was the lesson Ashoka tried to preserve beneath every uniform and every weapon. The body could be powerful without becoming cruel. The mind had to remain clear when fear narrowed it. Spirit was the decision to keep strength answerable to a purpose.</w:t>
+      </w:r>
+    </w:p>
+    <w:p>
+      <w:r>
+        <w:t>The lesson had always been misunderstood outside Ashoka. The gana trained defenders who could display violence only when violence was necessary, and restraint when it was not. Ashoka allowed other institutions to mistake discipline for simplicity. There was advantage in being underestimated. Beneath the hard rooms, the red uniforms, and the silence of its responders, the gana preserved an intellectual tradition of judgment, proportion, and responsibility that few outsiders had bothered to study.</w:t>
       </w:r>
     </w:p>
     <w:p>

</xml_diff>